<commit_message>
Rebuild Review 2/3 decks and report with the served CRNN numbers
</commit_message>
<xml_diff>
--- a/docs/Review3/SafeScape_Case_Study_Report.docx
+++ b/docs/Review3/SafeScape_Case_Study_Report.docx
@@ -128,7 +128,7 @@
       <w:pPr>
         <w:pStyle w:val="Heading1"/>
       </w:pPr>
-      <w:bookmarkStart w:id="0" w:name="_Toc242140549"/>
+      <w:bookmarkStart w:id="0" w:name="_Toc242143075"/>
       <w:r>
         <w:lastRenderedPageBreak/>
         <w:t>Abstract</w:t>
@@ -150,7 +150,7 @@
         <w:jc w:val="both"/>
       </w:pPr>
       <w:r>
-        <w:t>This case study trains and compares three architectures on one dataset of 2,919 public recordings (21,917 windows), split by source file, with test windows whose audio also appears in training removed after a duplicate audit: an MFCC-based CNN, a log-mel CRNN (CNN front-end with a bidirectional GRU), and a tiny Transformer distilled from the CRNN. On the held-out test split the CRNN is the strongest model, with 89.7% accuracy, macro-F1 0.853 and distress-call recall 86.5%; after dynamic int8 quantization it</w:t>
+        <w:t>This case study trains and compares three architectures on one dataset of 2,919 public recordings (21,917 windows), split by source file, with test windows whose audio also appears in training removed after a duplicate audit: an MFCC-based CNN, a log-mel CRNN (CNN front-end with a bidirectional GRU), and a tiny Transformer distilled from the CRNN. On the held-out test split the CRNN is the strongest model, with 89.7% accuracy, macro-F1 0.852 and distress-call recall 86.7%; after dynamic int8 quantization it</w:t>
       </w:r>
       <w:r>
         <w:t xml:space="preserve"> is 516 KB. All three models are served by one FastAPI back-end and compared side by side in a web dashboard, which is also used to test the user interface on held-out clips. Post-hoc, safety-constrained logit calibration and a multi-window inference rule are introduced to keep hazard recall high without retraining.</w:t>
@@ -206,7 +206,7 @@
       <w:r>
         <w:fldChar w:fldCharType="separate"/>
       </w:r>
-      <w:hyperlink w:anchor="_Toc242140549" w:history="1">
+      <w:hyperlink w:anchor="_Toc242143075" w:history="1">
         <w:r>
           <w:rPr>
             <w:rStyle w:val="Hyperlink"/>
@@ -233,7 +233,7 @@
             <w:noProof/>
             <w:webHidden/>
           </w:rPr>
-          <w:instrText xml:space="preserve"> PAGEREF _Toc242140549 \h </w:instrText>
+          <w:instrText xml:space="preserve"> PAGEREF _Toc242143075 \h </w:instrText>
         </w:r>
         <w:r>
           <w:rPr>
@@ -274,7 +274,7 @@
           <w:noProof/>
         </w:rPr>
       </w:pPr>
-      <w:hyperlink w:anchor="_Toc242140550" w:history="1">
+      <w:hyperlink w:anchor="_Toc242143076" w:history="1">
         <w:r>
           <w:rPr>
             <w:rStyle w:val="Hyperlink"/>
@@ -301,7 +301,7 @@
             <w:noProof/>
             <w:webHidden/>
           </w:rPr>
-          <w:instrText xml:space="preserve"> PAGEREF _Toc242140550 \h </w:instrText>
+          <w:instrText xml:space="preserve"> PAGEREF _Toc242143076 \h </w:instrText>
         </w:r>
         <w:r>
           <w:rPr>
@@ -342,7 +342,7 @@
           <w:noProof/>
         </w:rPr>
       </w:pPr>
-      <w:hyperlink w:anchor="_Toc242140551" w:history="1">
+      <w:hyperlink w:anchor="_Toc242143077" w:history="1">
         <w:r>
           <w:rPr>
             <w:rStyle w:val="Hyperlink"/>
@@ -369,7 +369,7 @@
             <w:noProof/>
             <w:webHidden/>
           </w:rPr>
-          <w:instrText xml:space="preserve"> PAGEREF _Toc242140551 \h </w:instrText>
+          <w:instrText xml:space="preserve"> PAGEREF _Toc242143077 \h </w:instrText>
         </w:r>
         <w:r>
           <w:rPr>
@@ -410,7 +410,7 @@
           <w:noProof/>
         </w:rPr>
       </w:pPr>
-      <w:hyperlink w:anchor="_Toc242140552" w:history="1">
+      <w:hyperlink w:anchor="_Toc242143078" w:history="1">
         <w:r>
           <w:rPr>
             <w:rStyle w:val="Hyperlink"/>
@@ -437,7 +437,7 @@
             <w:noProof/>
             <w:webHidden/>
           </w:rPr>
-          <w:instrText xml:space="preserve"> PAGEREF _Toc242140552 \h </w:instrText>
+          <w:instrText xml:space="preserve"> PAGEREF _Toc242143078 \h </w:instrText>
         </w:r>
         <w:r>
           <w:rPr>
@@ -478,7 +478,7 @@
           <w:noProof/>
         </w:rPr>
       </w:pPr>
-      <w:hyperlink w:anchor="_Toc242140553" w:history="1">
+      <w:hyperlink w:anchor="_Toc242143079" w:history="1">
         <w:r>
           <w:rPr>
             <w:rStyle w:val="Hyperlink"/>
@@ -505,7 +505,7 @@
             <w:noProof/>
             <w:webHidden/>
           </w:rPr>
-          <w:instrText xml:space="preserve"> PAGEREF _Toc242140553 \h </w:instrText>
+          <w:instrText xml:space="preserve"> PAGEREF _Toc242143079 \h </w:instrText>
         </w:r>
         <w:r>
           <w:rPr>
@@ -546,7 +546,7 @@
           <w:noProof/>
         </w:rPr>
       </w:pPr>
-      <w:hyperlink w:anchor="_Toc242140554" w:history="1">
+      <w:hyperlink w:anchor="_Toc242143080" w:history="1">
         <w:r>
           <w:rPr>
             <w:rStyle w:val="Hyperlink"/>
@@ -573,7 +573,7 @@
             <w:noProof/>
             <w:webHidden/>
           </w:rPr>
-          <w:instrText xml:space="preserve"> PAGEREF _Toc242140554 \h </w:instrText>
+          <w:instrText xml:space="preserve"> PAGEREF _Toc242143080 \h </w:instrText>
         </w:r>
         <w:r>
           <w:rPr>
@@ -614,7 +614,7 @@
           <w:noProof/>
         </w:rPr>
       </w:pPr>
-      <w:hyperlink w:anchor="_Toc242140555" w:history="1">
+      <w:hyperlink w:anchor="_Toc242143081" w:history="1">
         <w:r>
           <w:rPr>
             <w:rStyle w:val="Hyperlink"/>
@@ -641,7 +641,7 @@
             <w:noProof/>
             <w:webHidden/>
           </w:rPr>
-          <w:instrText xml:space="preserve"> PAGEREF _Toc242140555 \h </w:instrText>
+          <w:instrText xml:space="preserve"> PAGEREF _Toc242143081 \h </w:instrText>
         </w:r>
         <w:r>
           <w:rPr>
@@ -682,7 +682,7 @@
           <w:noProof/>
         </w:rPr>
       </w:pPr>
-      <w:hyperlink w:anchor="_Toc242140556" w:history="1">
+      <w:hyperlink w:anchor="_Toc242143082" w:history="1">
         <w:r>
           <w:rPr>
             <w:rStyle w:val="Hyperlink"/>
@@ -709,7 +709,7 @@
             <w:noProof/>
             <w:webHidden/>
           </w:rPr>
-          <w:instrText xml:space="preserve"> PAGEREF _Toc242140556 \h </w:instrText>
+          <w:instrText xml:space="preserve"> PAGEREF _Toc242143082 \h </w:instrText>
         </w:r>
         <w:r>
           <w:rPr>
@@ -750,7 +750,7 @@
           <w:noProof/>
         </w:rPr>
       </w:pPr>
-      <w:hyperlink w:anchor="_Toc242140557" w:history="1">
+      <w:hyperlink w:anchor="_Toc242143083" w:history="1">
         <w:r>
           <w:rPr>
             <w:rStyle w:val="Hyperlink"/>
@@ -777,7 +777,7 @@
             <w:noProof/>
             <w:webHidden/>
           </w:rPr>
-          <w:instrText xml:space="preserve"> PAGEREF _Toc242140557 \h </w:instrText>
+          <w:instrText xml:space="preserve"> PAGEREF _Toc242143083 \h </w:instrText>
         </w:r>
         <w:r>
           <w:rPr>
@@ -818,7 +818,7 @@
           <w:noProof/>
         </w:rPr>
       </w:pPr>
-      <w:hyperlink w:anchor="_Toc242140558" w:history="1">
+      <w:hyperlink w:anchor="_Toc242143084" w:history="1">
         <w:r>
           <w:rPr>
             <w:rStyle w:val="Hyperlink"/>
@@ -845,7 +845,7 @@
             <w:noProof/>
             <w:webHidden/>
           </w:rPr>
-          <w:instrText xml:space="preserve"> PAGEREF _Toc242140558 \h </w:instrText>
+          <w:instrText xml:space="preserve"> PAGEREF _Toc242143084 \h </w:instrText>
         </w:r>
         <w:r>
           <w:rPr>
@@ -886,7 +886,7 @@
           <w:noProof/>
         </w:rPr>
       </w:pPr>
-      <w:hyperlink w:anchor="_Toc242140559" w:history="1">
+      <w:hyperlink w:anchor="_Toc242143085" w:history="1">
         <w:r>
           <w:rPr>
             <w:rStyle w:val="Hyperlink"/>
@@ -913,7 +913,7 @@
             <w:noProof/>
             <w:webHidden/>
           </w:rPr>
-          <w:instrText xml:space="preserve"> PAGEREF _Toc242140559 \h </w:instrText>
+          <w:instrText xml:space="preserve"> PAGEREF _Toc242143085 \h </w:instrText>
         </w:r>
         <w:r>
           <w:rPr>
@@ -954,7 +954,7 @@
           <w:noProof/>
         </w:rPr>
       </w:pPr>
-      <w:hyperlink w:anchor="_Toc242140560" w:history="1">
+      <w:hyperlink w:anchor="_Toc242143086" w:history="1">
         <w:r>
           <w:rPr>
             <w:rStyle w:val="Hyperlink"/>
@@ -981,7 +981,7 @@
             <w:noProof/>
             <w:webHidden/>
           </w:rPr>
-          <w:instrText xml:space="preserve"> PAGEREF _Toc242140560 \h </w:instrText>
+          <w:instrText xml:space="preserve"> PAGEREF _Toc242143086 \h </w:instrText>
         </w:r>
         <w:r>
           <w:rPr>
@@ -1022,7 +1022,7 @@
           <w:noProof/>
         </w:rPr>
       </w:pPr>
-      <w:hyperlink w:anchor="_Toc242140561" w:history="1">
+      <w:hyperlink w:anchor="_Toc242143087" w:history="1">
         <w:r>
           <w:rPr>
             <w:rStyle w:val="Hyperlink"/>
@@ -1049,7 +1049,7 @@
             <w:noProof/>
             <w:webHidden/>
           </w:rPr>
-          <w:instrText xml:space="preserve"> PAGEREF _Toc242140561 \h </w:instrText>
+          <w:instrText xml:space="preserve"> PAGEREF _Toc242143087 \h </w:instrText>
         </w:r>
         <w:r>
           <w:rPr>
@@ -1090,7 +1090,7 @@
           <w:noProof/>
         </w:rPr>
       </w:pPr>
-      <w:hyperlink w:anchor="_Toc242140562" w:history="1">
+      <w:hyperlink w:anchor="_Toc242143088" w:history="1">
         <w:r>
           <w:rPr>
             <w:rStyle w:val="Hyperlink"/>
@@ -1117,7 +1117,7 @@
             <w:noProof/>
             <w:webHidden/>
           </w:rPr>
-          <w:instrText xml:space="preserve"> PAGEREF _Toc242140562 \h </w:instrText>
+          <w:instrText xml:space="preserve"> PAGEREF _Toc242143088 \h </w:instrText>
         </w:r>
         <w:r>
           <w:rPr>
@@ -1158,7 +1158,7 @@
           <w:noProof/>
         </w:rPr>
       </w:pPr>
-      <w:hyperlink w:anchor="_Toc242140563" w:history="1">
+      <w:hyperlink w:anchor="_Toc242143089" w:history="1">
         <w:r>
           <w:rPr>
             <w:rStyle w:val="Hyperlink"/>
@@ -1185,7 +1185,7 @@
             <w:noProof/>
             <w:webHidden/>
           </w:rPr>
-          <w:instrText xml:space="preserve"> PAGEREF _Toc242140563 \h </w:instrText>
+          <w:instrText xml:space="preserve"> PAGEREF _Toc242143089 \h </w:instrText>
         </w:r>
         <w:r>
           <w:rPr>
@@ -1226,7 +1226,7 @@
           <w:noProof/>
         </w:rPr>
       </w:pPr>
-      <w:hyperlink w:anchor="_Toc242140564" w:history="1">
+      <w:hyperlink w:anchor="_Toc242143090" w:history="1">
         <w:r>
           <w:rPr>
             <w:rStyle w:val="Hyperlink"/>
@@ -1253,7 +1253,7 @@
             <w:noProof/>
             <w:webHidden/>
           </w:rPr>
-          <w:instrText xml:space="preserve"> PAGEREF _Toc242140564 \h </w:instrText>
+          <w:instrText xml:space="preserve"> PAGEREF _Toc242143090 \h </w:instrText>
         </w:r>
         <w:r>
           <w:rPr>
@@ -1294,7 +1294,7 @@
           <w:noProof/>
         </w:rPr>
       </w:pPr>
-      <w:hyperlink w:anchor="_Toc242140565" w:history="1">
+      <w:hyperlink w:anchor="_Toc242143091" w:history="1">
         <w:r>
           <w:rPr>
             <w:rStyle w:val="Hyperlink"/>
@@ -1321,7 +1321,7 @@
             <w:noProof/>
             <w:webHidden/>
           </w:rPr>
-          <w:instrText xml:space="preserve"> PAGEREF _Toc242140565 \h </w:instrText>
+          <w:instrText xml:space="preserve"> PAGEREF _Toc242143091 \h </w:instrText>
         </w:r>
         <w:r>
           <w:rPr>
@@ -1362,7 +1362,7 @@
           <w:noProof/>
         </w:rPr>
       </w:pPr>
-      <w:hyperlink w:anchor="_Toc242140566" w:history="1">
+      <w:hyperlink w:anchor="_Toc242143092" w:history="1">
         <w:r>
           <w:rPr>
             <w:rStyle w:val="Hyperlink"/>
@@ -1389,7 +1389,7 @@
             <w:noProof/>
             <w:webHidden/>
           </w:rPr>
-          <w:instrText xml:space="preserve"> PAGEREF _Toc242140566 \h </w:instrText>
+          <w:instrText xml:space="preserve"> PAGEREF _Toc242143092 \h </w:instrText>
         </w:r>
         <w:r>
           <w:rPr>
@@ -1430,7 +1430,7 @@
           <w:noProof/>
         </w:rPr>
       </w:pPr>
-      <w:hyperlink w:anchor="_Toc242140567" w:history="1">
+      <w:hyperlink w:anchor="_Toc242143093" w:history="1">
         <w:r>
           <w:rPr>
             <w:rStyle w:val="Hyperlink"/>
@@ -1457,7 +1457,7 @@
             <w:noProof/>
             <w:webHidden/>
           </w:rPr>
-          <w:instrText xml:space="preserve"> PAGEREF _Toc242140567 \h </w:instrText>
+          <w:instrText xml:space="preserve"> PAGEREF _Toc242143093 \h </w:instrText>
         </w:r>
         <w:r>
           <w:rPr>
@@ -1477,7 +1477,7 @@
             <w:noProof/>
             <w:webHidden/>
           </w:rPr>
-          <w:t>9</w:t>
+          <w:t>10</w:t>
         </w:r>
         <w:r>
           <w:rPr>
@@ -1498,7 +1498,7 @@
           <w:noProof/>
         </w:rPr>
       </w:pPr>
-      <w:hyperlink w:anchor="_Toc242140568" w:history="1">
+      <w:hyperlink w:anchor="_Toc242143094" w:history="1">
         <w:r>
           <w:rPr>
             <w:rStyle w:val="Hyperlink"/>
@@ -1525,7 +1525,7 @@
             <w:noProof/>
             <w:webHidden/>
           </w:rPr>
-          <w:instrText xml:space="preserve"> PAGEREF _Toc242140568 \h </w:instrText>
+          <w:instrText xml:space="preserve"> PAGEREF _Toc242143094 \h </w:instrText>
         </w:r>
         <w:r>
           <w:rPr>
@@ -1566,7 +1566,7 @@
           <w:noProof/>
         </w:rPr>
       </w:pPr>
-      <w:hyperlink w:anchor="_Toc242140569" w:history="1">
+      <w:hyperlink w:anchor="_Toc242143095" w:history="1">
         <w:r>
           <w:rPr>
             <w:rStyle w:val="Hyperlink"/>
@@ -1593,7 +1593,7 @@
             <w:noProof/>
             <w:webHidden/>
           </w:rPr>
-          <w:instrText xml:space="preserve"> PAGEREF _Toc242140569 \h </w:instrText>
+          <w:instrText xml:space="preserve"> PAGEREF _Toc242143095 \h </w:instrText>
         </w:r>
         <w:r>
           <w:rPr>
@@ -1634,7 +1634,7 @@
           <w:noProof/>
         </w:rPr>
       </w:pPr>
-      <w:hyperlink w:anchor="_Toc242140570" w:history="1">
+      <w:hyperlink w:anchor="_Toc242143096" w:history="1">
         <w:r>
           <w:rPr>
             <w:rStyle w:val="Hyperlink"/>
@@ -1661,7 +1661,7 @@
             <w:noProof/>
             <w:webHidden/>
           </w:rPr>
-          <w:instrText xml:space="preserve"> PAGEREF _Toc242140570 \h </w:instrText>
+          <w:instrText xml:space="preserve"> PAGEREF _Toc242143096 \h </w:instrText>
         </w:r>
         <w:r>
           <w:rPr>
@@ -1681,7 +1681,7 @@
             <w:noProof/>
             <w:webHidden/>
           </w:rPr>
-          <w:t>10</w:t>
+          <w:t>11</w:t>
         </w:r>
         <w:r>
           <w:rPr>
@@ -1702,7 +1702,7 @@
           <w:noProof/>
         </w:rPr>
       </w:pPr>
-      <w:hyperlink w:anchor="_Toc242140571" w:history="1">
+      <w:hyperlink w:anchor="_Toc242143097" w:history="1">
         <w:r>
           <w:rPr>
             <w:rStyle w:val="Hyperlink"/>
@@ -1729,7 +1729,7 @@
             <w:noProof/>
             <w:webHidden/>
           </w:rPr>
-          <w:instrText xml:space="preserve"> PAGEREF _Toc242140571 \h </w:instrText>
+          <w:instrText xml:space="preserve"> PAGEREF _Toc242143097 \h </w:instrText>
         </w:r>
         <w:r>
           <w:rPr>
@@ -1770,7 +1770,7 @@
           <w:noProof/>
         </w:rPr>
       </w:pPr>
-      <w:hyperlink w:anchor="_Toc242140572" w:history="1">
+      <w:hyperlink w:anchor="_Toc242143098" w:history="1">
         <w:r>
           <w:rPr>
             <w:rStyle w:val="Hyperlink"/>
@@ -1797,7 +1797,7 @@
             <w:noProof/>
             <w:webHidden/>
           </w:rPr>
-          <w:instrText xml:space="preserve"> PAGEREF _Toc242140572 \h </w:instrText>
+          <w:instrText xml:space="preserve"> PAGEREF _Toc242143098 \h </w:instrText>
         </w:r>
         <w:r>
           <w:rPr>
@@ -1838,7 +1838,7 @@
           <w:noProof/>
         </w:rPr>
       </w:pPr>
-      <w:hyperlink w:anchor="_Toc242140573" w:history="1">
+      <w:hyperlink w:anchor="_Toc242143099" w:history="1">
         <w:r>
           <w:rPr>
             <w:rStyle w:val="Hyperlink"/>
@@ -1865,7 +1865,7 @@
             <w:noProof/>
             <w:webHidden/>
           </w:rPr>
-          <w:instrText xml:space="preserve"> PAGEREF _Toc242140573 \h </w:instrText>
+          <w:instrText xml:space="preserve"> PAGEREF _Toc242143099 \h </w:instrText>
         </w:r>
         <w:r>
           <w:rPr>
@@ -1885,7 +1885,7 @@
             <w:noProof/>
             <w:webHidden/>
           </w:rPr>
-          <w:t>11</w:t>
+          <w:t>12</w:t>
         </w:r>
         <w:r>
           <w:rPr>
@@ -1906,7 +1906,7 @@
           <w:noProof/>
         </w:rPr>
       </w:pPr>
-      <w:hyperlink w:anchor="_Toc242140574" w:history="1">
+      <w:hyperlink w:anchor="_Toc242143100" w:history="1">
         <w:r>
           <w:rPr>
             <w:rStyle w:val="Hyperlink"/>
@@ -1933,7 +1933,7 @@
             <w:noProof/>
             <w:webHidden/>
           </w:rPr>
-          <w:instrText xml:space="preserve"> PAGEREF _Toc242140574 \h </w:instrText>
+          <w:instrText xml:space="preserve"> PAGEREF _Toc242143100 \h </w:instrText>
         </w:r>
         <w:r>
           <w:rPr>
@@ -1974,7 +1974,7 @@
           <w:noProof/>
         </w:rPr>
       </w:pPr>
-      <w:hyperlink w:anchor="_Toc242140575" w:history="1">
+      <w:hyperlink w:anchor="_Toc242143101" w:history="1">
         <w:r>
           <w:rPr>
             <w:rStyle w:val="Hyperlink"/>
@@ -2001,7 +2001,7 @@
             <w:noProof/>
             <w:webHidden/>
           </w:rPr>
-          <w:instrText xml:space="preserve"> PAGEREF _Toc242140575 \h </w:instrText>
+          <w:instrText xml:space="preserve"> PAGEREF _Toc242143101 \h </w:instrText>
         </w:r>
         <w:r>
           <w:rPr>
@@ -2042,7 +2042,7 @@
           <w:noProof/>
         </w:rPr>
       </w:pPr>
-      <w:hyperlink w:anchor="_Toc242140576" w:history="1">
+      <w:hyperlink w:anchor="_Toc242143102" w:history="1">
         <w:r>
           <w:rPr>
             <w:rStyle w:val="Hyperlink"/>
@@ -2069,7 +2069,7 @@
             <w:noProof/>
             <w:webHidden/>
           </w:rPr>
-          <w:instrText xml:space="preserve"> PAGEREF _Toc242140576 \h </w:instrText>
+          <w:instrText xml:space="preserve"> PAGEREF _Toc242143102 \h </w:instrText>
         </w:r>
         <w:r>
           <w:rPr>
@@ -2110,7 +2110,7 @@
           <w:noProof/>
         </w:rPr>
       </w:pPr>
-      <w:hyperlink w:anchor="_Toc242140577" w:history="1">
+      <w:hyperlink w:anchor="_Toc242143103" w:history="1">
         <w:r>
           <w:rPr>
             <w:rStyle w:val="Hyperlink"/>
@@ -2137,7 +2137,7 @@
             <w:noProof/>
             <w:webHidden/>
           </w:rPr>
-          <w:instrText xml:space="preserve"> PAGEREF _Toc242140577 \h </w:instrText>
+          <w:instrText xml:space="preserve"> PAGEREF _Toc242143103 \h </w:instrText>
         </w:r>
         <w:r>
           <w:rPr>
@@ -2178,7 +2178,7 @@
           <w:noProof/>
         </w:rPr>
       </w:pPr>
-      <w:hyperlink w:anchor="_Toc242140578" w:history="1">
+      <w:hyperlink w:anchor="_Toc242143104" w:history="1">
         <w:r>
           <w:rPr>
             <w:rStyle w:val="Hyperlink"/>
@@ -2205,7 +2205,7 @@
             <w:noProof/>
             <w:webHidden/>
           </w:rPr>
-          <w:instrText xml:space="preserve"> PAGEREF _Toc242140578 \h </w:instrText>
+          <w:instrText xml:space="preserve"> PAGEREF _Toc242143104 \h </w:instrText>
         </w:r>
         <w:r>
           <w:rPr>
@@ -2246,7 +2246,7 @@
           <w:noProof/>
         </w:rPr>
       </w:pPr>
-      <w:hyperlink w:anchor="_Toc242140579" w:history="1">
+      <w:hyperlink w:anchor="_Toc242143105" w:history="1">
         <w:r>
           <w:rPr>
             <w:rStyle w:val="Hyperlink"/>
@@ -2273,7 +2273,7 @@
             <w:noProof/>
             <w:webHidden/>
           </w:rPr>
-          <w:instrText xml:space="preserve"> PAGEREF _Toc242140579 \h </w:instrText>
+          <w:instrText xml:space="preserve"> PAGEREF _Toc242143105 \h </w:instrText>
         </w:r>
         <w:r>
           <w:rPr>
@@ -2314,7 +2314,7 @@
           <w:noProof/>
         </w:rPr>
       </w:pPr>
-      <w:hyperlink w:anchor="_Toc242140580" w:history="1">
+      <w:hyperlink w:anchor="_Toc242143106" w:history="1">
         <w:r>
           <w:rPr>
             <w:rStyle w:val="Hyperlink"/>
@@ -2341,7 +2341,7 @@
             <w:noProof/>
             <w:webHidden/>
           </w:rPr>
-          <w:instrText xml:space="preserve"> PAGEREF _Toc242140580 \h </w:instrText>
+          <w:instrText xml:space="preserve"> PAGEREF _Toc242143106 \h </w:instrText>
         </w:r>
         <w:r>
           <w:rPr>
@@ -2382,7 +2382,7 @@
           <w:noProof/>
         </w:rPr>
       </w:pPr>
-      <w:hyperlink w:anchor="_Toc242140581" w:history="1">
+      <w:hyperlink w:anchor="_Toc242143107" w:history="1">
         <w:r>
           <w:rPr>
             <w:rStyle w:val="Hyperlink"/>
@@ -2409,7 +2409,7 @@
             <w:noProof/>
             <w:webHidden/>
           </w:rPr>
-          <w:instrText xml:space="preserve"> PAGEREF _Toc242140581 \h </w:instrText>
+          <w:instrText xml:space="preserve"> PAGEREF _Toc242143107 \h </w:instrText>
         </w:r>
         <w:r>
           <w:rPr>
@@ -2450,7 +2450,7 @@
           <w:noProof/>
         </w:rPr>
       </w:pPr>
-      <w:hyperlink w:anchor="_Toc242140582" w:history="1">
+      <w:hyperlink w:anchor="_Toc242143108" w:history="1">
         <w:r>
           <w:rPr>
             <w:rStyle w:val="Hyperlink"/>
@@ -2477,7 +2477,7 @@
             <w:noProof/>
             <w:webHidden/>
           </w:rPr>
-          <w:instrText xml:space="preserve"> PAGEREF _Toc242140582 \h </w:instrText>
+          <w:instrText xml:space="preserve"> PAGEREF _Toc242143108 \h </w:instrText>
         </w:r>
         <w:r>
           <w:rPr>
@@ -2522,7 +2522,7 @@
       <w:pPr>
         <w:pStyle w:val="Heading1"/>
       </w:pPr>
-      <w:bookmarkStart w:id="1" w:name="_Toc242140550"/>
+      <w:bookmarkStart w:id="1" w:name="_Toc242143076"/>
       <w:r>
         <w:t>1. Introduction</w:t>
       </w:r>
@@ -2532,7 +2532,7 @@
       <w:pPr>
         <w:pStyle w:val="Heading2"/>
       </w:pPr>
-      <w:bookmarkStart w:id="2" w:name="_Toc242140551"/>
+      <w:bookmarkStart w:id="2" w:name="_Toc242143077"/>
       <w:r>
         <w:t>1.1 Problem statement</w:t>
       </w:r>
@@ -2554,7 +2554,7 @@
       <w:pPr>
         <w:pStyle w:val="Heading2"/>
       </w:pPr>
-      <w:bookmarkStart w:id="3" w:name="_Toc242140552"/>
+      <w:bookmarkStart w:id="3" w:name="_Toc242143078"/>
       <w:r>
         <w:t>1.2 Motivation</w:t>
       </w:r>
@@ -2576,7 +2576,7 @@
       <w:pPr>
         <w:pStyle w:val="Heading2"/>
       </w:pPr>
-      <w:bookmarkStart w:id="4" w:name="_Toc242140553"/>
+      <w:bookmarkStart w:id="4" w:name="_Toc242143079"/>
       <w:r>
         <w:t>1.3 Objectives</w:t>
       </w:r>
@@ -2626,7 +2626,7 @@
       <w:pPr>
         <w:pStyle w:val="Heading2"/>
       </w:pPr>
-      <w:bookmarkStart w:id="5" w:name="_Toc242140554"/>
+      <w:bookmarkStart w:id="5" w:name="_Toc242143080"/>
       <w:r>
         <w:t>1.4 Contributions</w:t>
       </w:r>
@@ -2676,7 +2676,7 @@
       <w:pPr>
         <w:pStyle w:val="Heading1"/>
       </w:pPr>
-      <w:bookmarkStart w:id="6" w:name="_Toc242140555"/>
+      <w:bookmarkStart w:id="6" w:name="_Toc242143081"/>
       <w:r>
         <w:t>2. Literature Survey</w:t>
       </w:r>
@@ -2695,7 +2695,7 @@
       <w:pPr>
         <w:pStyle w:val="Heading2"/>
       </w:pPr>
-      <w:bookmarkStart w:id="7" w:name="_Toc242140556"/>
+      <w:bookmarkStart w:id="7" w:name="_Toc242143082"/>
       <w:r>
         <w:t>2.1 MFCC-CNN (surveyed by Amruth Rohan KR)</w:t>
       </w:r>
@@ -3165,7 +3165,7 @@
       <w:pPr>
         <w:pStyle w:val="Heading2"/>
       </w:pPr>
-      <w:bookmarkStart w:id="8" w:name="_Toc242140557"/>
+      <w:bookmarkStart w:id="8" w:name="_Toc242143083"/>
       <w:r>
         <w:t>2.2 log-mel CRNN (surveyed by Harish Venkat VS)</w:t>
       </w:r>
@@ -3635,7 +3635,7 @@
       <w:pPr>
         <w:pStyle w:val="Heading2"/>
       </w:pPr>
-      <w:bookmarkStart w:id="9" w:name="_Toc242140558"/>
+      <w:bookmarkStart w:id="9" w:name="_Toc242143084"/>
       <w:r>
         <w:t>2.3 Distilled Tiny Transformer (surveyed by Harish Venkat VS)</w:t>
       </w:r>
@@ -4105,7 +4105,7 @@
       <w:pPr>
         <w:pStyle w:val="Heading2"/>
       </w:pPr>
-      <w:bookmarkStart w:id="10" w:name="_Toc242140559"/>
+      <w:bookmarkStart w:id="10" w:name="_Toc242143085"/>
       <w:r>
         <w:t>2.4 Standard paper</w:t>
       </w:r>
@@ -4127,7 +4127,7 @@
       <w:pPr>
         <w:pStyle w:val="Heading1"/>
       </w:pPr>
-      <w:bookmarkStart w:id="11" w:name="_Toc242140560"/>
+      <w:bookmarkStart w:id="11" w:name="_Toc242143086"/>
       <w:r>
         <w:t>3. Dataset</w:t>
       </w:r>
@@ -5011,7 +5011,7 @@
       <w:pPr>
         <w:pStyle w:val="Heading2"/>
       </w:pPr>
-      <w:bookmarkStart w:id="12" w:name="_Toc242140561"/>
+      <w:bookmarkStart w:id="12" w:name="_Toc242143087"/>
       <w:r>
         <w:t>3.1 Pre-processing and split</w:t>
       </w:r>
@@ -5030,7 +5030,7 @@
       <w:pPr>
         <w:pStyle w:val="Heading2"/>
       </w:pPr>
-      <w:bookmarkStart w:id="13" w:name="_Toc242140562"/>
+      <w:bookmarkStart w:id="13" w:name="_Toc242143088"/>
       <w:r>
         <w:t>3.2 Duplicate audit</w:t>
       </w:r>
@@ -5042,10 +5042,10 @@
         <w:jc w:val="both"/>
       </w:pPr>
       <w:r>
-        <w:t xml:space="preserve">Hashing every source file revealed that the Kaggle scream set ships the same recordings in two folders. Because the split is by file path, 230 test windows — all distress_call — were byte-identical to recordings in the training or validation split. Rather than re-split and retrain every model, those windows are flagged (scripts/18_flag_duplicate_sources.py) and excluded: every test number in this report is computed on the remaining 2,990 windows, which no model has heard in any form. Validation retains 169 </w:t>
+        <w:t>Hashing every source file revealed that the Kaggle scream set ships the same recordings in two folders. Because the split is by file path, 230 test windows — all distress_call — were byte-identical to recordings in the training or validation split. Rather than re-split and retrain every model, those windows are flagged (scripts/18_flag_duplicate_sources.py) and excluded: every test number in this report is computed on the remaining 2,990 windows, none of which has a byte-identical copy in training. The chec</w:t>
       </w:r>
       <w:r>
-        <w:t>such windows; it is used only for checkpoint selection and calibration, and this is listed as a limitation.</w:t>
+        <w:t>k is exact-match only: a trimmed or re-encoded copy of the same recording (ESC-50, UrbanSound8K and the Freesound previews all draw on Freesound) would not be caught. Validation retains 169 such windows; it is used only for checkpoint selection and calibration, and this is listed as a limitation.</w:t>
       </w:r>
     </w:p>
     <w:p>
@@ -5512,7 +5512,7 @@
       <w:pPr>
         <w:pStyle w:val="Heading1"/>
       </w:pPr>
-      <w:bookmarkStart w:id="14" w:name="_Toc242140563"/>
+      <w:bookmarkStart w:id="14" w:name="_Toc242143089"/>
       <w:r>
         <w:t>4. Methodology</w:t>
       </w:r>
@@ -5522,7 +5522,7 @@
       <w:pPr>
         <w:pStyle w:val="Heading2"/>
       </w:pPr>
-      <w:bookmarkStart w:id="15" w:name="_Toc242140564"/>
+      <w:bookmarkStart w:id="15" w:name="_Toc242143090"/>
       <w:r>
         <w:t>4.1 Features</w:t>
       </w:r>
@@ -5541,7 +5541,7 @@
       <w:pPr>
         <w:pStyle w:val="Heading2"/>
       </w:pPr>
-      <w:bookmarkStart w:id="16" w:name="_Toc242140565"/>
+      <w:bookmarkStart w:id="16" w:name="_Toc242143091"/>
       <w:r>
         <w:t>4.2 MFCC-CNN (Amruth Rohan KR)</w:t>
       </w:r>
@@ -5560,7 +5560,7 @@
       <w:pPr>
         <w:pStyle w:val="Heading2"/>
       </w:pPr>
-      <w:bookmarkStart w:id="17" w:name="_Toc242140566"/>
+      <w:bookmarkStart w:id="17" w:name="_Toc242143092"/>
       <w:r>
         <w:t>4.3 Log-mel CRNN (Harish Venkat VS)</w:t>
       </w:r>
@@ -5587,7 +5587,7 @@
           <w:noProof/>
         </w:rPr>
         <w:drawing>
-          <wp:inline distT="0" distB="0" distL="0" distR="0" wp14:anchorId="7EF255FB" wp14:editId="31D97EFD">
+          <wp:inline distT="0" distB="0" distL="0" distR="0" wp14:anchorId="30F81B30" wp14:editId="3937C6A5">
             <wp:extent cx="5400000" cy="1632558"/>
             <wp:effectExtent l="0" t="0" r="0" b="0"/>
             <wp:docPr id="1" name="Picture 1"/>
@@ -5636,7 +5636,7 @@
       <w:pPr>
         <w:pStyle w:val="Heading2"/>
       </w:pPr>
-      <w:bookmarkStart w:id="18" w:name="_Toc242140567"/>
+      <w:bookmarkStart w:id="18" w:name="_Toc242143093"/>
       <w:r>
         <w:t>4.4 Distilled Transformer (Harish Venkat VS)</w:t>
       </w:r>
@@ -5658,7 +5658,7 @@
       <w:pPr>
         <w:pStyle w:val="Heading2"/>
       </w:pPr>
-      <w:bookmarkStart w:id="19" w:name="_Toc242140568"/>
+      <w:bookmarkStart w:id="19" w:name="_Toc242143094"/>
       <w:r>
         <w:t>4.5 Training</w:t>
       </w:r>
@@ -6053,7 +6053,7 @@
       <w:pPr>
         <w:pStyle w:val="Heading2"/>
       </w:pPr>
-      <w:bookmarkStart w:id="20" w:name="_Toc242140569"/>
+      <w:bookmarkStart w:id="20" w:name="_Toc242143095"/>
       <w:r>
         <w:t>4.6 Safety-constrained calibration</w:t>
       </w:r>
@@ -6075,7 +6075,7 @@
       <w:pPr>
         <w:pStyle w:val="Heading2"/>
       </w:pPr>
-      <w:bookmarkStart w:id="21" w:name="_Toc242140570"/>
+      <w:bookmarkStart w:id="21" w:name="_Toc242143096"/>
       <w:r>
         <w:t>4.7 Compression</w:t>
       </w:r>
@@ -6094,7 +6094,7 @@
       <w:pPr>
         <w:pStyle w:val="Heading2"/>
       </w:pPr>
-      <w:bookmarkStart w:id="22" w:name="_Toc242140571"/>
+      <w:bookmarkStart w:id="22" w:name="_Toc242143097"/>
       <w:r>
         <w:t>4.8 Serving rule</w:t>
       </w:r>
@@ -6116,7 +6116,7 @@
       <w:pPr>
         <w:pStyle w:val="Heading1"/>
       </w:pPr>
-      <w:bookmarkStart w:id="23" w:name="_Toc242140572"/>
+      <w:bookmarkStart w:id="23" w:name="_Toc242143098"/>
       <w:r>
         <w:t>5. System Design and User Interface</w:t>
       </w:r>
@@ -6131,7 +6131,7 @@
           <w:noProof/>
         </w:rPr>
         <w:drawing>
-          <wp:inline distT="0" distB="0" distL="0" distR="0" wp14:anchorId="7FE96CAC" wp14:editId="38FB0E9A">
+          <wp:inline distT="0" distB="0" distL="0" distR="0" wp14:anchorId="2BCC895A" wp14:editId="60BDFA44">
             <wp:extent cx="5580000" cy="2123654"/>
             <wp:effectExtent l="0" t="0" r="0" b="0"/>
             <wp:docPr id="2" name="Picture 2"/>
@@ -6403,7 +6403,7 @@
       <w:pPr>
         <w:pStyle w:val="Heading2"/>
       </w:pPr>
-      <w:bookmarkStart w:id="24" w:name="_Toc242140573"/>
+      <w:bookmarkStart w:id="24" w:name="_Toc242143099"/>
       <w:r>
         <w:t>5.1 Mobile app</w:t>
       </w:r>
@@ -6446,7 +6446,7 @@
                 <w:noProof/>
               </w:rPr>
               <w:drawing>
-                <wp:inline distT="0" distB="0" distL="0" distR="0" wp14:anchorId="126BF733" wp14:editId="52F71D6B">
+                <wp:inline distT="0" distB="0" distL="0" distR="0" wp14:anchorId="7336E1DC" wp14:editId="1B83A8FD">
                   <wp:extent cx="1655999" cy="2980798"/>
                   <wp:effectExtent l="0" t="0" r="0" b="0"/>
                   <wp:docPr id="3" name="Picture 3"/>
@@ -6507,7 +6507,7 @@
                 <w:noProof/>
               </w:rPr>
               <w:drawing>
-                <wp:inline distT="0" distB="0" distL="0" distR="0" wp14:anchorId="6D306D0E" wp14:editId="75D4B475">
+                <wp:inline distT="0" distB="0" distL="0" distR="0" wp14:anchorId="24F6B353" wp14:editId="274A4095">
                   <wp:extent cx="1655999" cy="2980798"/>
                   <wp:effectExtent l="0" t="0" r="0" b="0"/>
                   <wp:docPr id="4" name="Picture 4"/>
@@ -6568,7 +6568,7 @@
                 <w:noProof/>
               </w:rPr>
               <w:drawing>
-                <wp:inline distT="0" distB="0" distL="0" distR="0" wp14:anchorId="7C1BEECD" wp14:editId="56A529E1">
+                <wp:inline distT="0" distB="0" distL="0" distR="0" wp14:anchorId="669C6E44" wp14:editId="1A3F1440">
                   <wp:extent cx="1655999" cy="2980798"/>
                   <wp:effectExtent l="0" t="0" r="0" b="0"/>
                   <wp:docPr id="5" name="Picture 5"/>
@@ -6631,7 +6631,7 @@
       <w:pPr>
         <w:pStyle w:val="Heading2"/>
       </w:pPr>
-      <w:bookmarkStart w:id="25" w:name="_Toc242140574"/>
+      <w:bookmarkStart w:id="25" w:name="_Toc242143100"/>
       <w:r>
         <w:t>5.2 Comparison dashboard</w:t>
       </w:r>
@@ -6658,7 +6658,7 @@
           <w:noProof/>
         </w:rPr>
         <w:drawing>
-          <wp:inline distT="0" distB="0" distL="0" distR="0" wp14:anchorId="19447CE0" wp14:editId="73775292">
+          <wp:inline distT="0" distB="0" distL="0" distR="0" wp14:anchorId="00F8A429" wp14:editId="5DBE6241">
             <wp:extent cx="5760000" cy="4600000"/>
             <wp:effectExtent l="0" t="0" r="0" b="0"/>
             <wp:docPr id="6" name="Picture 6"/>
@@ -6712,7 +6712,7 @@
           <w:noProof/>
         </w:rPr>
         <w:drawing>
-          <wp:inline distT="0" distB="0" distL="0" distR="0" wp14:anchorId="43A7A9E5" wp14:editId="122D7D9A">
+          <wp:inline distT="0" distB="0" distL="0" distR="0" wp14:anchorId="6BCC3BA4" wp14:editId="1518FAB1">
             <wp:extent cx="5760000" cy="4240000"/>
             <wp:effectExtent l="0" t="0" r="0" b="0"/>
             <wp:docPr id="7" name="Picture 7"/>
@@ -6766,7 +6766,7 @@
           <w:noProof/>
         </w:rPr>
         <w:drawing>
-          <wp:inline distT="0" distB="0" distL="0" distR="0" wp14:anchorId="76383464" wp14:editId="653ECA0D">
+          <wp:inline distT="0" distB="0" distL="0" distR="0" wp14:anchorId="7A56125E" wp14:editId="530B9795">
             <wp:extent cx="5760000" cy="3520000"/>
             <wp:effectExtent l="0" t="0" r="0" b="0"/>
             <wp:docPr id="8" name="Picture 8"/>
@@ -6815,7 +6815,7 @@
       <w:pPr>
         <w:pStyle w:val="Heading1"/>
       </w:pPr>
-      <w:bookmarkStart w:id="26" w:name="_Toc242140575"/>
+      <w:bookmarkStart w:id="26" w:name="_Toc242143101"/>
       <w:r>
         <w:t>6. Results and Comparison</w:t>
       </w:r>
@@ -6827,7 +6827,7 @@
         <w:jc w:val="both"/>
       </w:pPr>
       <w:r>
-        <w:t>All figures are on the leak-free held-out test split (2,990 windows), with each model's safety-constrained calibration applied. Latency is the mean time for one 1 s window on the CPU, batch size 1.</w:t>
+        <w:t>All figures are on the leak-free held-out test split (2,990 windows), with each model's safety-constrained calibration applied. Every row is the exact file the server loads, so the CRNN figures are for its int8 version. Latency is the mean time for one 1 s window on the CPU, batch size 1.</w:t>
       </w:r>
     </w:p>
     <w:p>
@@ -7180,7 +7180,7 @@
               <w:rPr>
                 <w:sz w:val="19"/>
               </w:rPr>
-              <w:t>0.853</w:t>
+              <w:t>0.852</w:t>
             </w:r>
           </w:p>
         </w:tc>
@@ -7193,7 +7193,7 @@
               <w:rPr>
                 <w:sz w:val="19"/>
               </w:rPr>
-              <w:t>86.1%</w:t>
+              <w:t>86.2%</w:t>
             </w:r>
           </w:p>
         </w:tc>
@@ -7206,7 +7206,7 @@
               <w:rPr>
                 <w:sz w:val="19"/>
               </w:rPr>
-              <w:t>86.5%</w:t>
+              <w:t>86.7%</w:t>
             </w:r>
           </w:p>
         </w:tc>
@@ -7245,7 +7245,7 @@
               <w:rPr>
                 <w:sz w:val="19"/>
               </w:rPr>
-              <w:t>6.90 ms</w:t>
+              <w:t>12.81 ms</w:t>
             </w:r>
           </w:p>
         </w:tc>
@@ -7664,7 +7664,7 @@
               <w:rPr>
                 <w:sz w:val="19"/>
               </w:rPr>
-              <w:t>0.69</w:t>
+              <w:t>0.68</w:t>
             </w:r>
           </w:p>
         </w:tc>
@@ -8026,7 +8026,7 @@
                 <w:noProof/>
               </w:rPr>
               <w:drawing>
-                <wp:inline distT="0" distB="0" distL="0" distR="0" wp14:anchorId="34DA39F4" wp14:editId="32EE0854">
+                <wp:inline distT="0" distB="0" distL="0" distR="0" wp14:anchorId="7EC31DA5" wp14:editId="1E554013">
                   <wp:extent cx="1944000" cy="1620000"/>
                   <wp:effectExtent l="0" t="0" r="0" b="0"/>
                   <wp:docPr id="9" name="Picture 9"/>
@@ -8087,7 +8087,7 @@
                 <w:noProof/>
               </w:rPr>
               <w:drawing>
-                <wp:inline distT="0" distB="0" distL="0" distR="0" wp14:anchorId="70C24B51" wp14:editId="68D0433B">
+                <wp:inline distT="0" distB="0" distL="0" distR="0" wp14:anchorId="4787D991" wp14:editId="41B26026">
                   <wp:extent cx="1944000" cy="1620000"/>
                   <wp:effectExtent l="0" t="0" r="0" b="0"/>
                   <wp:docPr id="10" name="Picture 10"/>
@@ -8098,7 +8098,7 @@
                     <a:graphicData uri="http://schemas.openxmlformats.org/drawingml/2006/picture">
                       <pic:pic xmlns:pic="http://schemas.openxmlformats.org/drawingml/2006/picture">
                         <pic:nvPicPr>
-                          <pic:cNvPr id="0" name="logmel_crnn_v2_leakfree_confusion_matrix.png"/>
+                          <pic:cNvPr id="0" name="logmel_crnn_v2_int8_leakfree_confusion_matrix.png"/>
                           <pic:cNvPicPr/>
                         </pic:nvPicPr>
                         <pic:blipFill>
@@ -8148,7 +8148,7 @@
                 <w:noProof/>
               </w:rPr>
               <w:drawing>
-                <wp:inline distT="0" distB="0" distL="0" distR="0" wp14:anchorId="18B0225A" wp14:editId="38228A19">
+                <wp:inline distT="0" distB="0" distL="0" distR="0" wp14:anchorId="731F6ECA" wp14:editId="17EA252F">
                   <wp:extent cx="1944000" cy="1620000"/>
                   <wp:effectExtent l="0" t="0" r="0" b="0"/>
                   <wp:docPr id="11" name="Picture 11"/>
@@ -8216,7 +8216,7 @@
           <w:noProof/>
         </w:rPr>
         <w:drawing>
-          <wp:inline distT="0" distB="0" distL="0" distR="0" wp14:anchorId="2018ABCA" wp14:editId="6D831B87">
+          <wp:inline distT="0" distB="0" distL="0" distR="0" wp14:anchorId="0CA141D6" wp14:editId="21676657">
             <wp:extent cx="5040000" cy="2592000"/>
             <wp:effectExtent l="0" t="0" r="0" b="0"/>
             <wp:docPr id="12" name="Picture 12"/>
@@ -8265,7 +8265,7 @@
       <w:pPr>
         <w:pStyle w:val="Heading2"/>
       </w:pPr>
-      <w:bookmarkStart w:id="27" w:name="_Toc242140576"/>
+      <w:bookmarkStart w:id="27" w:name="_Toc242143102"/>
       <w:r>
         <w:t>6.1 Discussion</w:t>
       </w:r>
@@ -8277,7 +8277,7 @@
         <w:jc w:val="both"/>
       </w:pPr>
       <w:r>
-        <w:t>The CRNN leads on every quality metric (macro-F1 0.853 against 0.774 for the Transformer and 0.725 for the MFCC-CNN). Two design choices account for most of the gap. Log-mel features keep the spectral detail that the MFCC's cosine transform compresses away, and the CRNN's recurrent layer models how a sound evolves over the window, where the CNN can only pool over it.</w:t>
+        <w:t>The CRNN leads on every quality metric (macro-F1 0.852 against 0.774 for the Transformer and 0.725 for the MFCC-CNN). Two design choices account for most of the gap. Log-mel features keep the spectral detail that the MFCC's cosine transform compresses away, and the CRNN's recurrent layer models how a sound evolves over the window, where the CNN can only pool over it.</w:t>
       </w:r>
     </w:p>
     <w:p>
@@ -8286,7 +8286,7 @@
         <w:jc w:val="both"/>
       </w:pPr>
       <w:r>
-        <w:t>The distilled Transformer has 84,293 parameters against the CRNN's 499,237 and runs in 0.48 ms per window against 6.90 ms. Distillation transfers much, but not all, of the teacher's behaviour; on a dataset of this size the teacher's convolutional inductive bias still wins.</w:t>
+        <w:t>The distilled Transformer has 84,293 parameters against the CRNN's 499,237 and runs in 0.48 ms per window against 12.81 ms. Distillation transfers much, but not all, of the teacher's behaviour; on a dataset of this size the teacher's convolutional inductive bias still wins.</w:t>
       </w:r>
     </w:p>
     <w:p>
@@ -8311,7 +8311,7 @@
       <w:pPr>
         <w:pStyle w:val="Heading1"/>
       </w:pPr>
-      <w:bookmarkStart w:id="28" w:name="_Toc242140577"/>
+      <w:bookmarkStart w:id="28" w:name="_Toc242143103"/>
       <w:r>
         <w:t>7. UI Testing with the Deep Learning Models</w:t>
       </w:r>
@@ -8323,7 +8323,7 @@
         <w:jc w:val="both"/>
       </w:pPr>
       <w:r>
-        <w:t>The user interface was tested against all three models with twenty clips — four per class — cut from test-split recordings that the duplicate audit confirmed no model has heard. Each clip is the two seconds around the loudest second of its source, the same length the app records. The table below is produced by running the served bundles on those clips; the dashboard's test run produces the same grid through HTTP.</w:t>
+        <w:t>The user interface was tested against all three models with twenty clips — four per class — cut from test-split recordings with no byte-identical copy in training. Each clip is the two seconds around the loudest second of its source, the same length the app records. The table below is produced by running the served bundles on those clips; the dashboard's test run produces the same grid through HTTP.</w:t>
       </w:r>
     </w:p>
     <w:p>
@@ -10263,7 +10263,7 @@
       <w:pPr>
         <w:pStyle w:val="Heading2"/>
       </w:pPr>
-      <w:bookmarkStart w:id="29" w:name="_Toc242140578"/>
+      <w:bookmarkStart w:id="29" w:name="_Toc242143104"/>
       <w:r>
         <w:t>7.1 Functional and edge-case tests</w:t>
       </w:r>
@@ -10678,7 +10678,7 @@
       <w:pPr>
         <w:pStyle w:val="Heading1"/>
       </w:pPr>
-      <w:bookmarkStart w:id="30" w:name="_Toc242140579"/>
+      <w:bookmarkStart w:id="30" w:name="_Toc242143105"/>
       <w:r>
         <w:t>8. Limitations and Future Work</w:t>
       </w:r>
@@ -10752,7 +10752,7 @@
       <w:pPr>
         <w:pStyle w:val="Heading1"/>
       </w:pPr>
-      <w:bookmarkStart w:id="31" w:name="_Toc242140580"/>
+      <w:bookmarkStart w:id="31" w:name="_Toc242143106"/>
       <w:r>
         <w:t>9. Conclusion</w:t>
       </w:r>
@@ -10764,17 +10764,17 @@
         <w:jc w:val="both"/>
       </w:pPr>
       <w:r>
-        <w:t xml:space="preserve">SafeScape shows that a small, fully offline model can recognise acoustic hazards with useful accuracy. The log-mel CRNN reached 89.7% accuracy and 86.5% distress-call recall on audio no model had heard, in 516 KB after quantization. The comparison suggests that, for short acoustic events, keeping the time axis and modelling it explicitly matters more than raw model size, and that data coverage of the rare classes mattered more than any architectural change. Integrating all three models behind one interface </w:t>
+        <w:t>SafeScape shows that a small, fully offline model can recognise acoustic hazards with useful accuracy. The log-mel CRNN reached 89.7% accuracy and 86.7% distress-call recall on held-out audio, in 516 KB after quantization. The comparison suggests that, for short acoustic events, keeping the time axis and modelling it explicitly matters more than raw model size, and that data coverage of the rare classes mattered more than any architectural change. Integrating all three models behind one interface made these</w:t>
       </w:r>
       <w:r>
-        <w:t>made these differences visible clip by clip, and testing that interface surfaced a serving defect that offline metrics alone would have missed.</w:t>
+        <w:t xml:space="preserve"> differences visible clip by clip, and testing that interface surfaced a serving defect that offline metrics alone would have missed.</w:t>
       </w:r>
     </w:p>
     <w:p>
       <w:pPr>
         <w:pStyle w:val="Heading1"/>
       </w:pPr>
-      <w:bookmarkStart w:id="32" w:name="_Toc242140581"/>
+      <w:bookmarkStart w:id="32" w:name="_Toc242143107"/>
       <w:r>
         <w:t>10. Individual Contributions</w:t>
       </w:r>
@@ -10896,7 +10896,7 @@
       <w:pPr>
         <w:pStyle w:val="Heading1"/>
       </w:pPr>
-      <w:bookmarkStart w:id="33" w:name="_Toc242140582"/>
+      <w:bookmarkStart w:id="33" w:name="_Toc242143108"/>
       <w:r>
         <w:t>References</w:t>
       </w:r>
@@ -11327,31 +11327,31 @@
       </w:rPr>
     </w:lvl>
   </w:abstractNum>
-  <w:num w:numId="1" w16cid:durableId="1633637595">
+  <w:num w:numId="1" w16cid:durableId="846480381">
     <w:abstractNumId w:val="8"/>
   </w:num>
-  <w:num w:numId="2" w16cid:durableId="1737509461">
+  <w:num w:numId="2" w16cid:durableId="1123764971">
     <w:abstractNumId w:val="6"/>
   </w:num>
-  <w:num w:numId="3" w16cid:durableId="253822843">
+  <w:num w:numId="3" w16cid:durableId="1931815904">
     <w:abstractNumId w:val="5"/>
   </w:num>
-  <w:num w:numId="4" w16cid:durableId="188959423">
+  <w:num w:numId="4" w16cid:durableId="2129660122">
     <w:abstractNumId w:val="4"/>
   </w:num>
-  <w:num w:numId="5" w16cid:durableId="1058237400">
+  <w:num w:numId="5" w16cid:durableId="152571110">
     <w:abstractNumId w:val="7"/>
   </w:num>
-  <w:num w:numId="6" w16cid:durableId="775752413">
+  <w:num w:numId="6" w16cid:durableId="1215311817">
     <w:abstractNumId w:val="3"/>
   </w:num>
-  <w:num w:numId="7" w16cid:durableId="613951231">
+  <w:num w:numId="7" w16cid:durableId="658072511">
     <w:abstractNumId w:val="2"/>
   </w:num>
-  <w:num w:numId="8" w16cid:durableId="1308320307">
+  <w:num w:numId="8" w16cid:durableId="2122340818">
     <w:abstractNumId w:val="1"/>
   </w:num>
-  <w:num w:numId="9" w16cid:durableId="1925072252">
+  <w:num w:numId="9" w16cid:durableId="273561647">
     <w:abstractNumId w:val="0"/>
   </w:num>
 </w:numbering>
@@ -22747,7 +22747,7 @@
     <w:autoRedefine/>
     <w:uiPriority w:val="39"/>
     <w:unhideWhenUsed/>
-    <w:rsid w:val="009045B6"/>
+    <w:rsid w:val="00CD2D36"/>
     <w:pPr>
       <w:spacing w:after="100"/>
     </w:pPr>
@@ -22759,7 +22759,7 @@
     <w:autoRedefine/>
     <w:uiPriority w:val="39"/>
     <w:unhideWhenUsed/>
-    <w:rsid w:val="009045B6"/>
+    <w:rsid w:val="00CD2D36"/>
     <w:pPr>
       <w:spacing w:after="100"/>
       <w:ind w:left="240"/>
@@ -22770,7 +22770,7 @@
     <w:basedOn w:val="DefaultParagraphFont"/>
     <w:uiPriority w:val="99"/>
     <w:unhideWhenUsed/>
-    <w:rsid w:val="009045B6"/>
+    <w:rsid w:val="00CD2D36"/>
     <w:rPr>
       <w:color w:val="0000FF" w:themeColor="hyperlink"/>
       <w:u w:val="single"/>

</xml_diff>

<commit_message>
Compute the report and deck figures instead of typing them
</commit_message>
<xml_diff>
--- a/docs/Review3/SafeScape_Case_Study_Report.docx
+++ b/docs/Review3/SafeScape_Case_Study_Report.docx
@@ -128,7 +128,7 @@
       <w:pPr>
         <w:pStyle w:val="Heading1"/>
       </w:pPr>
-      <w:bookmarkStart w:id="0" w:name="_Toc242143075"/>
+      <w:bookmarkStart w:id="0" w:name="_Toc242148479"/>
       <w:r>
         <w:lastRenderedPageBreak/>
         <w:t>Abstract</w:t>
@@ -206,7 +206,7 @@
       <w:r>
         <w:fldChar w:fldCharType="separate"/>
       </w:r>
-      <w:hyperlink w:anchor="_Toc242143075" w:history="1">
+      <w:hyperlink w:anchor="_Toc242148479" w:history="1">
         <w:r>
           <w:rPr>
             <w:rStyle w:val="Hyperlink"/>
@@ -233,7 +233,7 @@
             <w:noProof/>
             <w:webHidden/>
           </w:rPr>
-          <w:instrText xml:space="preserve"> PAGEREF _Toc242143075 \h </w:instrText>
+          <w:instrText xml:space="preserve"> PAGEREF _Toc242148479 \h </w:instrText>
         </w:r>
         <w:r>
           <w:rPr>
@@ -274,7 +274,7 @@
           <w:noProof/>
         </w:rPr>
       </w:pPr>
-      <w:hyperlink w:anchor="_Toc242143076" w:history="1">
+      <w:hyperlink w:anchor="_Toc242148480" w:history="1">
         <w:r>
           <w:rPr>
             <w:rStyle w:val="Hyperlink"/>
@@ -301,7 +301,7 @@
             <w:noProof/>
             <w:webHidden/>
           </w:rPr>
-          <w:instrText xml:space="preserve"> PAGEREF _Toc242143076 \h </w:instrText>
+          <w:instrText xml:space="preserve"> PAGEREF _Toc242148480 \h </w:instrText>
         </w:r>
         <w:r>
           <w:rPr>
@@ -342,7 +342,7 @@
           <w:noProof/>
         </w:rPr>
       </w:pPr>
-      <w:hyperlink w:anchor="_Toc242143077" w:history="1">
+      <w:hyperlink w:anchor="_Toc242148481" w:history="1">
         <w:r>
           <w:rPr>
             <w:rStyle w:val="Hyperlink"/>
@@ -369,7 +369,7 @@
             <w:noProof/>
             <w:webHidden/>
           </w:rPr>
-          <w:instrText xml:space="preserve"> PAGEREF _Toc242143077 \h </w:instrText>
+          <w:instrText xml:space="preserve"> PAGEREF _Toc242148481 \h </w:instrText>
         </w:r>
         <w:r>
           <w:rPr>
@@ -410,7 +410,7 @@
           <w:noProof/>
         </w:rPr>
       </w:pPr>
-      <w:hyperlink w:anchor="_Toc242143078" w:history="1">
+      <w:hyperlink w:anchor="_Toc242148482" w:history="1">
         <w:r>
           <w:rPr>
             <w:rStyle w:val="Hyperlink"/>
@@ -437,7 +437,7 @@
             <w:noProof/>
             <w:webHidden/>
           </w:rPr>
-          <w:instrText xml:space="preserve"> PAGEREF _Toc242143078 \h </w:instrText>
+          <w:instrText xml:space="preserve"> PAGEREF _Toc242148482 \h </w:instrText>
         </w:r>
         <w:r>
           <w:rPr>
@@ -478,7 +478,7 @@
           <w:noProof/>
         </w:rPr>
       </w:pPr>
-      <w:hyperlink w:anchor="_Toc242143079" w:history="1">
+      <w:hyperlink w:anchor="_Toc242148483" w:history="1">
         <w:r>
           <w:rPr>
             <w:rStyle w:val="Hyperlink"/>
@@ -505,7 +505,7 @@
             <w:noProof/>
             <w:webHidden/>
           </w:rPr>
-          <w:instrText xml:space="preserve"> PAGEREF _Toc242143079 \h </w:instrText>
+          <w:instrText xml:space="preserve"> PAGEREF _Toc242148483 \h </w:instrText>
         </w:r>
         <w:r>
           <w:rPr>
@@ -546,7 +546,7 @@
           <w:noProof/>
         </w:rPr>
       </w:pPr>
-      <w:hyperlink w:anchor="_Toc242143080" w:history="1">
+      <w:hyperlink w:anchor="_Toc242148484" w:history="1">
         <w:r>
           <w:rPr>
             <w:rStyle w:val="Hyperlink"/>
@@ -573,7 +573,7 @@
             <w:noProof/>
             <w:webHidden/>
           </w:rPr>
-          <w:instrText xml:space="preserve"> PAGEREF _Toc242143080 \h </w:instrText>
+          <w:instrText xml:space="preserve"> PAGEREF _Toc242148484 \h </w:instrText>
         </w:r>
         <w:r>
           <w:rPr>
@@ -614,7 +614,7 @@
           <w:noProof/>
         </w:rPr>
       </w:pPr>
-      <w:hyperlink w:anchor="_Toc242143081" w:history="1">
+      <w:hyperlink w:anchor="_Toc242148485" w:history="1">
         <w:r>
           <w:rPr>
             <w:rStyle w:val="Hyperlink"/>
@@ -641,7 +641,7 @@
             <w:noProof/>
             <w:webHidden/>
           </w:rPr>
-          <w:instrText xml:space="preserve"> PAGEREF _Toc242143081 \h </w:instrText>
+          <w:instrText xml:space="preserve"> PAGEREF _Toc242148485 \h </w:instrText>
         </w:r>
         <w:r>
           <w:rPr>
@@ -682,7 +682,7 @@
           <w:noProof/>
         </w:rPr>
       </w:pPr>
-      <w:hyperlink w:anchor="_Toc242143082" w:history="1">
+      <w:hyperlink w:anchor="_Toc242148486" w:history="1">
         <w:r>
           <w:rPr>
             <w:rStyle w:val="Hyperlink"/>
@@ -709,7 +709,7 @@
             <w:noProof/>
             <w:webHidden/>
           </w:rPr>
-          <w:instrText xml:space="preserve"> PAGEREF _Toc242143082 \h </w:instrText>
+          <w:instrText xml:space="preserve"> PAGEREF _Toc242148486 \h </w:instrText>
         </w:r>
         <w:r>
           <w:rPr>
@@ -750,7 +750,7 @@
           <w:noProof/>
         </w:rPr>
       </w:pPr>
-      <w:hyperlink w:anchor="_Toc242143083" w:history="1">
+      <w:hyperlink w:anchor="_Toc242148487" w:history="1">
         <w:r>
           <w:rPr>
             <w:rStyle w:val="Hyperlink"/>
@@ -777,7 +777,7 @@
             <w:noProof/>
             <w:webHidden/>
           </w:rPr>
-          <w:instrText xml:space="preserve"> PAGEREF _Toc242143083 \h </w:instrText>
+          <w:instrText xml:space="preserve"> PAGEREF _Toc242148487 \h </w:instrText>
         </w:r>
         <w:r>
           <w:rPr>
@@ -818,7 +818,7 @@
           <w:noProof/>
         </w:rPr>
       </w:pPr>
-      <w:hyperlink w:anchor="_Toc242143084" w:history="1">
+      <w:hyperlink w:anchor="_Toc242148488" w:history="1">
         <w:r>
           <w:rPr>
             <w:rStyle w:val="Hyperlink"/>
@@ -845,7 +845,7 @@
             <w:noProof/>
             <w:webHidden/>
           </w:rPr>
-          <w:instrText xml:space="preserve"> PAGEREF _Toc242143084 \h </w:instrText>
+          <w:instrText xml:space="preserve"> PAGEREF _Toc242148488 \h </w:instrText>
         </w:r>
         <w:r>
           <w:rPr>
@@ -886,7 +886,7 @@
           <w:noProof/>
         </w:rPr>
       </w:pPr>
-      <w:hyperlink w:anchor="_Toc242143085" w:history="1">
+      <w:hyperlink w:anchor="_Toc242148489" w:history="1">
         <w:r>
           <w:rPr>
             <w:rStyle w:val="Hyperlink"/>
@@ -913,7 +913,7 @@
             <w:noProof/>
             <w:webHidden/>
           </w:rPr>
-          <w:instrText xml:space="preserve"> PAGEREF _Toc242143085 \h </w:instrText>
+          <w:instrText xml:space="preserve"> PAGEREF _Toc242148489 \h </w:instrText>
         </w:r>
         <w:r>
           <w:rPr>
@@ -954,7 +954,7 @@
           <w:noProof/>
         </w:rPr>
       </w:pPr>
-      <w:hyperlink w:anchor="_Toc242143086" w:history="1">
+      <w:hyperlink w:anchor="_Toc242148490" w:history="1">
         <w:r>
           <w:rPr>
             <w:rStyle w:val="Hyperlink"/>
@@ -981,7 +981,7 @@
             <w:noProof/>
             <w:webHidden/>
           </w:rPr>
-          <w:instrText xml:space="preserve"> PAGEREF _Toc242143086 \h </w:instrText>
+          <w:instrText xml:space="preserve"> PAGEREF _Toc242148490 \h </w:instrText>
         </w:r>
         <w:r>
           <w:rPr>
@@ -1022,7 +1022,7 @@
           <w:noProof/>
         </w:rPr>
       </w:pPr>
-      <w:hyperlink w:anchor="_Toc242143087" w:history="1">
+      <w:hyperlink w:anchor="_Toc242148491" w:history="1">
         <w:r>
           <w:rPr>
             <w:rStyle w:val="Hyperlink"/>
@@ -1049,7 +1049,7 @@
             <w:noProof/>
             <w:webHidden/>
           </w:rPr>
-          <w:instrText xml:space="preserve"> PAGEREF _Toc242143087 \h </w:instrText>
+          <w:instrText xml:space="preserve"> PAGEREF _Toc242148491 \h </w:instrText>
         </w:r>
         <w:r>
           <w:rPr>
@@ -1090,7 +1090,7 @@
           <w:noProof/>
         </w:rPr>
       </w:pPr>
-      <w:hyperlink w:anchor="_Toc242143088" w:history="1">
+      <w:hyperlink w:anchor="_Toc242148492" w:history="1">
         <w:r>
           <w:rPr>
             <w:rStyle w:val="Hyperlink"/>
@@ -1117,7 +1117,7 @@
             <w:noProof/>
             <w:webHidden/>
           </w:rPr>
-          <w:instrText xml:space="preserve"> PAGEREF _Toc242143088 \h </w:instrText>
+          <w:instrText xml:space="preserve"> PAGEREF _Toc242148492 \h </w:instrText>
         </w:r>
         <w:r>
           <w:rPr>
@@ -1158,7 +1158,7 @@
           <w:noProof/>
         </w:rPr>
       </w:pPr>
-      <w:hyperlink w:anchor="_Toc242143089" w:history="1">
+      <w:hyperlink w:anchor="_Toc242148493" w:history="1">
         <w:r>
           <w:rPr>
             <w:rStyle w:val="Hyperlink"/>
@@ -1185,7 +1185,7 @@
             <w:noProof/>
             <w:webHidden/>
           </w:rPr>
-          <w:instrText xml:space="preserve"> PAGEREF _Toc242143089 \h </w:instrText>
+          <w:instrText xml:space="preserve"> PAGEREF _Toc242148493 \h </w:instrText>
         </w:r>
         <w:r>
           <w:rPr>
@@ -1226,7 +1226,7 @@
           <w:noProof/>
         </w:rPr>
       </w:pPr>
-      <w:hyperlink w:anchor="_Toc242143090" w:history="1">
+      <w:hyperlink w:anchor="_Toc242148494" w:history="1">
         <w:r>
           <w:rPr>
             <w:rStyle w:val="Hyperlink"/>
@@ -1253,7 +1253,7 @@
             <w:noProof/>
             <w:webHidden/>
           </w:rPr>
-          <w:instrText xml:space="preserve"> PAGEREF _Toc242143090 \h </w:instrText>
+          <w:instrText xml:space="preserve"> PAGEREF _Toc242148494 \h </w:instrText>
         </w:r>
         <w:r>
           <w:rPr>
@@ -1294,7 +1294,7 @@
           <w:noProof/>
         </w:rPr>
       </w:pPr>
-      <w:hyperlink w:anchor="_Toc242143091" w:history="1">
+      <w:hyperlink w:anchor="_Toc242148495" w:history="1">
         <w:r>
           <w:rPr>
             <w:rStyle w:val="Hyperlink"/>
@@ -1321,7 +1321,7 @@
             <w:noProof/>
             <w:webHidden/>
           </w:rPr>
-          <w:instrText xml:space="preserve"> PAGEREF _Toc242143091 \h </w:instrText>
+          <w:instrText xml:space="preserve"> PAGEREF _Toc242148495 \h </w:instrText>
         </w:r>
         <w:r>
           <w:rPr>
@@ -1362,7 +1362,7 @@
           <w:noProof/>
         </w:rPr>
       </w:pPr>
-      <w:hyperlink w:anchor="_Toc242143092" w:history="1">
+      <w:hyperlink w:anchor="_Toc242148496" w:history="1">
         <w:r>
           <w:rPr>
             <w:rStyle w:val="Hyperlink"/>
@@ -1389,7 +1389,7 @@
             <w:noProof/>
             <w:webHidden/>
           </w:rPr>
-          <w:instrText xml:space="preserve"> PAGEREF _Toc242143092 \h </w:instrText>
+          <w:instrText xml:space="preserve"> PAGEREF _Toc242148496 \h </w:instrText>
         </w:r>
         <w:r>
           <w:rPr>
@@ -1430,7 +1430,7 @@
           <w:noProof/>
         </w:rPr>
       </w:pPr>
-      <w:hyperlink w:anchor="_Toc242143093" w:history="1">
+      <w:hyperlink w:anchor="_Toc242148497" w:history="1">
         <w:r>
           <w:rPr>
             <w:rStyle w:val="Hyperlink"/>
@@ -1457,7 +1457,7 @@
             <w:noProof/>
             <w:webHidden/>
           </w:rPr>
-          <w:instrText xml:space="preserve"> PAGEREF _Toc242143093 \h </w:instrText>
+          <w:instrText xml:space="preserve"> PAGEREF _Toc242148497 \h </w:instrText>
         </w:r>
         <w:r>
           <w:rPr>
@@ -1498,7 +1498,7 @@
           <w:noProof/>
         </w:rPr>
       </w:pPr>
-      <w:hyperlink w:anchor="_Toc242143094" w:history="1">
+      <w:hyperlink w:anchor="_Toc242148498" w:history="1">
         <w:r>
           <w:rPr>
             <w:rStyle w:val="Hyperlink"/>
@@ -1525,7 +1525,7 @@
             <w:noProof/>
             <w:webHidden/>
           </w:rPr>
-          <w:instrText xml:space="preserve"> PAGEREF _Toc242143094 \h </w:instrText>
+          <w:instrText xml:space="preserve"> PAGEREF _Toc242148498 \h </w:instrText>
         </w:r>
         <w:r>
           <w:rPr>
@@ -1566,7 +1566,7 @@
           <w:noProof/>
         </w:rPr>
       </w:pPr>
-      <w:hyperlink w:anchor="_Toc242143095" w:history="1">
+      <w:hyperlink w:anchor="_Toc242148499" w:history="1">
         <w:r>
           <w:rPr>
             <w:rStyle w:val="Hyperlink"/>
@@ -1593,7 +1593,7 @@
             <w:noProof/>
             <w:webHidden/>
           </w:rPr>
-          <w:instrText xml:space="preserve"> PAGEREF _Toc242143095 \h </w:instrText>
+          <w:instrText xml:space="preserve"> PAGEREF _Toc242148499 \h </w:instrText>
         </w:r>
         <w:r>
           <w:rPr>
@@ -1634,7 +1634,7 @@
           <w:noProof/>
         </w:rPr>
       </w:pPr>
-      <w:hyperlink w:anchor="_Toc242143096" w:history="1">
+      <w:hyperlink w:anchor="_Toc242148500" w:history="1">
         <w:r>
           <w:rPr>
             <w:rStyle w:val="Hyperlink"/>
@@ -1661,7 +1661,7 @@
             <w:noProof/>
             <w:webHidden/>
           </w:rPr>
-          <w:instrText xml:space="preserve"> PAGEREF _Toc242143096 \h </w:instrText>
+          <w:instrText xml:space="preserve"> PAGEREF _Toc242148500 \h </w:instrText>
         </w:r>
         <w:r>
           <w:rPr>
@@ -1702,7 +1702,7 @@
           <w:noProof/>
         </w:rPr>
       </w:pPr>
-      <w:hyperlink w:anchor="_Toc242143097" w:history="1">
+      <w:hyperlink w:anchor="_Toc242148501" w:history="1">
         <w:r>
           <w:rPr>
             <w:rStyle w:val="Hyperlink"/>
@@ -1729,7 +1729,7 @@
             <w:noProof/>
             <w:webHidden/>
           </w:rPr>
-          <w:instrText xml:space="preserve"> PAGEREF _Toc242143097 \h </w:instrText>
+          <w:instrText xml:space="preserve"> PAGEREF _Toc242148501 \h </w:instrText>
         </w:r>
         <w:r>
           <w:rPr>
@@ -1770,7 +1770,7 @@
           <w:noProof/>
         </w:rPr>
       </w:pPr>
-      <w:hyperlink w:anchor="_Toc242143098" w:history="1">
+      <w:hyperlink w:anchor="_Toc242148502" w:history="1">
         <w:r>
           <w:rPr>
             <w:rStyle w:val="Hyperlink"/>
@@ -1797,7 +1797,7 @@
             <w:noProof/>
             <w:webHidden/>
           </w:rPr>
-          <w:instrText xml:space="preserve"> PAGEREF _Toc242143098 \h </w:instrText>
+          <w:instrText xml:space="preserve"> PAGEREF _Toc242148502 \h </w:instrText>
         </w:r>
         <w:r>
           <w:rPr>
@@ -1838,7 +1838,7 @@
           <w:noProof/>
         </w:rPr>
       </w:pPr>
-      <w:hyperlink w:anchor="_Toc242143099" w:history="1">
+      <w:hyperlink w:anchor="_Toc242148503" w:history="1">
         <w:r>
           <w:rPr>
             <w:rStyle w:val="Hyperlink"/>
@@ -1865,7 +1865,7 @@
             <w:noProof/>
             <w:webHidden/>
           </w:rPr>
-          <w:instrText xml:space="preserve"> PAGEREF _Toc242143099 \h </w:instrText>
+          <w:instrText xml:space="preserve"> PAGEREF _Toc242148503 \h </w:instrText>
         </w:r>
         <w:r>
           <w:rPr>
@@ -1906,7 +1906,7 @@
           <w:noProof/>
         </w:rPr>
       </w:pPr>
-      <w:hyperlink w:anchor="_Toc242143100" w:history="1">
+      <w:hyperlink w:anchor="_Toc242148504" w:history="1">
         <w:r>
           <w:rPr>
             <w:rStyle w:val="Hyperlink"/>
@@ -1933,7 +1933,7 @@
             <w:noProof/>
             <w:webHidden/>
           </w:rPr>
-          <w:instrText xml:space="preserve"> PAGEREF _Toc242143100 \h </w:instrText>
+          <w:instrText xml:space="preserve"> PAGEREF _Toc242148504 \h </w:instrText>
         </w:r>
         <w:r>
           <w:rPr>
@@ -1974,7 +1974,7 @@
           <w:noProof/>
         </w:rPr>
       </w:pPr>
-      <w:hyperlink w:anchor="_Toc242143101" w:history="1">
+      <w:hyperlink w:anchor="_Toc242148505" w:history="1">
         <w:r>
           <w:rPr>
             <w:rStyle w:val="Hyperlink"/>
@@ -2001,7 +2001,7 @@
             <w:noProof/>
             <w:webHidden/>
           </w:rPr>
-          <w:instrText xml:space="preserve"> PAGEREF _Toc242143101 \h </w:instrText>
+          <w:instrText xml:space="preserve"> PAGEREF _Toc242148505 \h </w:instrText>
         </w:r>
         <w:r>
           <w:rPr>
@@ -2042,7 +2042,7 @@
           <w:noProof/>
         </w:rPr>
       </w:pPr>
-      <w:hyperlink w:anchor="_Toc242143102" w:history="1">
+      <w:hyperlink w:anchor="_Toc242148506" w:history="1">
         <w:r>
           <w:rPr>
             <w:rStyle w:val="Hyperlink"/>
@@ -2069,7 +2069,7 @@
             <w:noProof/>
             <w:webHidden/>
           </w:rPr>
-          <w:instrText xml:space="preserve"> PAGEREF _Toc242143102 \h </w:instrText>
+          <w:instrText xml:space="preserve"> PAGEREF _Toc242148506 \h </w:instrText>
         </w:r>
         <w:r>
           <w:rPr>
@@ -2110,7 +2110,7 @@
           <w:noProof/>
         </w:rPr>
       </w:pPr>
-      <w:hyperlink w:anchor="_Toc242143103" w:history="1">
+      <w:hyperlink w:anchor="_Toc242148507" w:history="1">
         <w:r>
           <w:rPr>
             <w:rStyle w:val="Hyperlink"/>
@@ -2137,7 +2137,7 @@
             <w:noProof/>
             <w:webHidden/>
           </w:rPr>
-          <w:instrText xml:space="preserve"> PAGEREF _Toc242143103 \h </w:instrText>
+          <w:instrText xml:space="preserve"> PAGEREF _Toc242148507 \h </w:instrText>
         </w:r>
         <w:r>
           <w:rPr>
@@ -2178,7 +2178,7 @@
           <w:noProof/>
         </w:rPr>
       </w:pPr>
-      <w:hyperlink w:anchor="_Toc242143104" w:history="1">
+      <w:hyperlink w:anchor="_Toc242148508" w:history="1">
         <w:r>
           <w:rPr>
             <w:rStyle w:val="Hyperlink"/>
@@ -2205,7 +2205,7 @@
             <w:noProof/>
             <w:webHidden/>
           </w:rPr>
-          <w:instrText xml:space="preserve"> PAGEREF _Toc242143104 \h </w:instrText>
+          <w:instrText xml:space="preserve"> PAGEREF _Toc242148508 \h </w:instrText>
         </w:r>
         <w:r>
           <w:rPr>
@@ -2246,7 +2246,7 @@
           <w:noProof/>
         </w:rPr>
       </w:pPr>
-      <w:hyperlink w:anchor="_Toc242143105" w:history="1">
+      <w:hyperlink w:anchor="_Toc242148509" w:history="1">
         <w:r>
           <w:rPr>
             <w:rStyle w:val="Hyperlink"/>
@@ -2273,7 +2273,7 @@
             <w:noProof/>
             <w:webHidden/>
           </w:rPr>
-          <w:instrText xml:space="preserve"> PAGEREF _Toc242143105 \h </w:instrText>
+          <w:instrText xml:space="preserve"> PAGEREF _Toc242148509 \h </w:instrText>
         </w:r>
         <w:r>
           <w:rPr>
@@ -2314,7 +2314,7 @@
           <w:noProof/>
         </w:rPr>
       </w:pPr>
-      <w:hyperlink w:anchor="_Toc242143106" w:history="1">
+      <w:hyperlink w:anchor="_Toc242148510" w:history="1">
         <w:r>
           <w:rPr>
             <w:rStyle w:val="Hyperlink"/>
@@ -2341,7 +2341,7 @@
             <w:noProof/>
             <w:webHidden/>
           </w:rPr>
-          <w:instrText xml:space="preserve"> PAGEREF _Toc242143106 \h </w:instrText>
+          <w:instrText xml:space="preserve"> PAGEREF _Toc242148510 \h </w:instrText>
         </w:r>
         <w:r>
           <w:rPr>
@@ -2382,7 +2382,7 @@
           <w:noProof/>
         </w:rPr>
       </w:pPr>
-      <w:hyperlink w:anchor="_Toc242143107" w:history="1">
+      <w:hyperlink w:anchor="_Toc242148511" w:history="1">
         <w:r>
           <w:rPr>
             <w:rStyle w:val="Hyperlink"/>
@@ -2409,7 +2409,7 @@
             <w:noProof/>
             <w:webHidden/>
           </w:rPr>
-          <w:instrText xml:space="preserve"> PAGEREF _Toc242143107 \h </w:instrText>
+          <w:instrText xml:space="preserve"> PAGEREF _Toc242148511 \h </w:instrText>
         </w:r>
         <w:r>
           <w:rPr>
@@ -2450,7 +2450,7 @@
           <w:noProof/>
         </w:rPr>
       </w:pPr>
-      <w:hyperlink w:anchor="_Toc242143108" w:history="1">
+      <w:hyperlink w:anchor="_Toc242148512" w:history="1">
         <w:r>
           <w:rPr>
             <w:rStyle w:val="Hyperlink"/>
@@ -2477,7 +2477,7 @@
             <w:noProof/>
             <w:webHidden/>
           </w:rPr>
-          <w:instrText xml:space="preserve"> PAGEREF _Toc242143108 \h </w:instrText>
+          <w:instrText xml:space="preserve"> PAGEREF _Toc242148512 \h </w:instrText>
         </w:r>
         <w:r>
           <w:rPr>
@@ -2522,7 +2522,7 @@
       <w:pPr>
         <w:pStyle w:val="Heading1"/>
       </w:pPr>
-      <w:bookmarkStart w:id="1" w:name="_Toc242143076"/>
+      <w:bookmarkStart w:id="1" w:name="_Toc242148480"/>
       <w:r>
         <w:t>1. Introduction</w:t>
       </w:r>
@@ -2532,7 +2532,7 @@
       <w:pPr>
         <w:pStyle w:val="Heading2"/>
       </w:pPr>
-      <w:bookmarkStart w:id="2" w:name="_Toc242143077"/>
+      <w:bookmarkStart w:id="2" w:name="_Toc242148481"/>
       <w:r>
         <w:t>1.1 Problem statement</w:t>
       </w:r>
@@ -2554,7 +2554,7 @@
       <w:pPr>
         <w:pStyle w:val="Heading2"/>
       </w:pPr>
-      <w:bookmarkStart w:id="3" w:name="_Toc242143078"/>
+      <w:bookmarkStart w:id="3" w:name="_Toc242148482"/>
       <w:r>
         <w:t>1.2 Motivation</w:t>
       </w:r>
@@ -2576,7 +2576,7 @@
       <w:pPr>
         <w:pStyle w:val="Heading2"/>
       </w:pPr>
-      <w:bookmarkStart w:id="4" w:name="_Toc242143079"/>
+      <w:bookmarkStart w:id="4" w:name="_Toc242148483"/>
       <w:r>
         <w:t>1.3 Objectives</w:t>
       </w:r>
@@ -2626,7 +2626,7 @@
       <w:pPr>
         <w:pStyle w:val="Heading2"/>
       </w:pPr>
-      <w:bookmarkStart w:id="5" w:name="_Toc242143080"/>
+      <w:bookmarkStart w:id="5" w:name="_Toc242148484"/>
       <w:r>
         <w:t>1.4 Contributions</w:t>
       </w:r>
@@ -2676,7 +2676,7 @@
       <w:pPr>
         <w:pStyle w:val="Heading1"/>
       </w:pPr>
-      <w:bookmarkStart w:id="6" w:name="_Toc242143081"/>
+      <w:bookmarkStart w:id="6" w:name="_Toc242148485"/>
       <w:r>
         <w:t>2. Literature Survey</w:t>
       </w:r>
@@ -2695,7 +2695,7 @@
       <w:pPr>
         <w:pStyle w:val="Heading2"/>
       </w:pPr>
-      <w:bookmarkStart w:id="7" w:name="_Toc242143082"/>
+      <w:bookmarkStart w:id="7" w:name="_Toc242148486"/>
       <w:r>
         <w:t>2.1 MFCC-CNN (surveyed by Amruth Rohan KR)</w:t>
       </w:r>
@@ -3165,7 +3165,7 @@
       <w:pPr>
         <w:pStyle w:val="Heading2"/>
       </w:pPr>
-      <w:bookmarkStart w:id="8" w:name="_Toc242143083"/>
+      <w:bookmarkStart w:id="8" w:name="_Toc242148487"/>
       <w:r>
         <w:t>2.2 log-mel CRNN (surveyed by Harish Venkat VS)</w:t>
       </w:r>
@@ -3635,7 +3635,7 @@
       <w:pPr>
         <w:pStyle w:val="Heading2"/>
       </w:pPr>
-      <w:bookmarkStart w:id="9" w:name="_Toc242143084"/>
+      <w:bookmarkStart w:id="9" w:name="_Toc242148488"/>
       <w:r>
         <w:t>2.3 Distilled Tiny Transformer (surveyed by Harish Venkat VS)</w:t>
       </w:r>
@@ -4105,7 +4105,7 @@
       <w:pPr>
         <w:pStyle w:val="Heading2"/>
       </w:pPr>
-      <w:bookmarkStart w:id="10" w:name="_Toc242143085"/>
+      <w:bookmarkStart w:id="10" w:name="_Toc242148489"/>
       <w:r>
         <w:t>2.4 Standard paper</w:t>
       </w:r>
@@ -4127,7 +4127,7 @@
       <w:pPr>
         <w:pStyle w:val="Heading1"/>
       </w:pPr>
-      <w:bookmarkStart w:id="11" w:name="_Toc242143086"/>
+      <w:bookmarkStart w:id="11" w:name="_Toc242148490"/>
       <w:r>
         <w:t>3. Dataset</w:t>
       </w:r>
@@ -5011,7 +5011,7 @@
       <w:pPr>
         <w:pStyle w:val="Heading2"/>
       </w:pPr>
-      <w:bookmarkStart w:id="12" w:name="_Toc242143087"/>
+      <w:bookmarkStart w:id="12" w:name="_Toc242148491"/>
       <w:r>
         <w:t>3.1 Pre-processing and split</w:t>
       </w:r>
@@ -5030,7 +5030,7 @@
       <w:pPr>
         <w:pStyle w:val="Heading2"/>
       </w:pPr>
-      <w:bookmarkStart w:id="13" w:name="_Toc242143088"/>
+      <w:bookmarkStart w:id="13" w:name="_Toc242148492"/>
       <w:r>
         <w:t>3.2 Duplicate audit</w:t>
       </w:r>
@@ -5512,7 +5512,7 @@
       <w:pPr>
         <w:pStyle w:val="Heading1"/>
       </w:pPr>
-      <w:bookmarkStart w:id="14" w:name="_Toc242143089"/>
+      <w:bookmarkStart w:id="14" w:name="_Toc242148493"/>
       <w:r>
         <w:t>4. Methodology</w:t>
       </w:r>
@@ -5522,7 +5522,7 @@
       <w:pPr>
         <w:pStyle w:val="Heading2"/>
       </w:pPr>
-      <w:bookmarkStart w:id="15" w:name="_Toc242143090"/>
+      <w:bookmarkStart w:id="15" w:name="_Toc242148494"/>
       <w:r>
         <w:t>4.1 Features</w:t>
       </w:r>
@@ -5541,7 +5541,7 @@
       <w:pPr>
         <w:pStyle w:val="Heading2"/>
       </w:pPr>
-      <w:bookmarkStart w:id="16" w:name="_Toc242143091"/>
+      <w:bookmarkStart w:id="16" w:name="_Toc242148495"/>
       <w:r>
         <w:t>4.2 MFCC-CNN (Amruth Rohan KR)</w:t>
       </w:r>
@@ -5560,7 +5560,7 @@
       <w:pPr>
         <w:pStyle w:val="Heading2"/>
       </w:pPr>
-      <w:bookmarkStart w:id="17" w:name="_Toc242143092"/>
+      <w:bookmarkStart w:id="17" w:name="_Toc242148496"/>
       <w:r>
         <w:t>4.3 Log-mel CRNN (Harish Venkat VS)</w:t>
       </w:r>
@@ -5587,7 +5587,7 @@
           <w:noProof/>
         </w:rPr>
         <w:drawing>
-          <wp:inline distT="0" distB="0" distL="0" distR="0" wp14:anchorId="30F81B30" wp14:editId="3937C6A5">
+          <wp:inline distT="0" distB="0" distL="0" distR="0" wp14:anchorId="2177B164" wp14:editId="07DD0C65">
             <wp:extent cx="5400000" cy="1632558"/>
             <wp:effectExtent l="0" t="0" r="0" b="0"/>
             <wp:docPr id="1" name="Picture 1"/>
@@ -5636,7 +5636,7 @@
       <w:pPr>
         <w:pStyle w:val="Heading2"/>
       </w:pPr>
-      <w:bookmarkStart w:id="18" w:name="_Toc242143093"/>
+      <w:bookmarkStart w:id="18" w:name="_Toc242148497"/>
       <w:r>
         <w:t>4.4 Distilled Transformer (Harish Venkat VS)</w:t>
       </w:r>
@@ -5658,7 +5658,7 @@
       <w:pPr>
         <w:pStyle w:val="Heading2"/>
       </w:pPr>
-      <w:bookmarkStart w:id="19" w:name="_Toc242143094"/>
+      <w:bookmarkStart w:id="19" w:name="_Toc242148498"/>
       <w:r>
         <w:t>4.5 Training</w:t>
       </w:r>
@@ -6053,7 +6053,7 @@
       <w:pPr>
         <w:pStyle w:val="Heading2"/>
       </w:pPr>
-      <w:bookmarkStart w:id="20" w:name="_Toc242143095"/>
+      <w:bookmarkStart w:id="20" w:name="_Toc242148499"/>
       <w:r>
         <w:t>4.6 Safety-constrained calibration</w:t>
       </w:r>
@@ -6075,7 +6075,7 @@
       <w:pPr>
         <w:pStyle w:val="Heading2"/>
       </w:pPr>
-      <w:bookmarkStart w:id="21" w:name="_Toc242143096"/>
+      <w:bookmarkStart w:id="21" w:name="_Toc242148500"/>
       <w:r>
         <w:t>4.7 Compression</w:t>
       </w:r>
@@ -6094,7 +6094,7 @@
       <w:pPr>
         <w:pStyle w:val="Heading2"/>
       </w:pPr>
-      <w:bookmarkStart w:id="22" w:name="_Toc242143097"/>
+      <w:bookmarkStart w:id="22" w:name="_Toc242148501"/>
       <w:r>
         <w:t>4.8 Serving rule</w:t>
       </w:r>
@@ -6116,7 +6116,7 @@
       <w:pPr>
         <w:pStyle w:val="Heading1"/>
       </w:pPr>
-      <w:bookmarkStart w:id="23" w:name="_Toc242143098"/>
+      <w:bookmarkStart w:id="23" w:name="_Toc242148502"/>
       <w:r>
         <w:t>5. System Design and User Interface</w:t>
       </w:r>
@@ -6131,7 +6131,7 @@
           <w:noProof/>
         </w:rPr>
         <w:drawing>
-          <wp:inline distT="0" distB="0" distL="0" distR="0" wp14:anchorId="2BCC895A" wp14:editId="60BDFA44">
+          <wp:inline distT="0" distB="0" distL="0" distR="0" wp14:anchorId="4631219C" wp14:editId="65E329DF">
             <wp:extent cx="5580000" cy="2123654"/>
             <wp:effectExtent l="0" t="0" r="0" b="0"/>
             <wp:docPr id="2" name="Picture 2"/>
@@ -6403,7 +6403,7 @@
       <w:pPr>
         <w:pStyle w:val="Heading2"/>
       </w:pPr>
-      <w:bookmarkStart w:id="24" w:name="_Toc242143099"/>
+      <w:bookmarkStart w:id="24" w:name="_Toc242148503"/>
       <w:r>
         <w:t>5.1 Mobile app</w:t>
       </w:r>
@@ -6446,7 +6446,7 @@
                 <w:noProof/>
               </w:rPr>
               <w:drawing>
-                <wp:inline distT="0" distB="0" distL="0" distR="0" wp14:anchorId="7336E1DC" wp14:editId="1B83A8FD">
+                <wp:inline distT="0" distB="0" distL="0" distR="0" wp14:anchorId="56CA45CC" wp14:editId="28E491A1">
                   <wp:extent cx="1655999" cy="2980798"/>
                   <wp:effectExtent l="0" t="0" r="0" b="0"/>
                   <wp:docPr id="3" name="Picture 3"/>
@@ -6507,7 +6507,7 @@
                 <w:noProof/>
               </w:rPr>
               <w:drawing>
-                <wp:inline distT="0" distB="0" distL="0" distR="0" wp14:anchorId="24F6B353" wp14:editId="274A4095">
+                <wp:inline distT="0" distB="0" distL="0" distR="0" wp14:anchorId="63B3A441" wp14:editId="7DB1387D">
                   <wp:extent cx="1655999" cy="2980798"/>
                   <wp:effectExtent l="0" t="0" r="0" b="0"/>
                   <wp:docPr id="4" name="Picture 4"/>
@@ -6568,7 +6568,7 @@
                 <w:noProof/>
               </w:rPr>
               <w:drawing>
-                <wp:inline distT="0" distB="0" distL="0" distR="0" wp14:anchorId="669C6E44" wp14:editId="1A3F1440">
+                <wp:inline distT="0" distB="0" distL="0" distR="0" wp14:anchorId="12D0FC50" wp14:editId="766C47ED">
                   <wp:extent cx="1655999" cy="2980798"/>
                   <wp:effectExtent l="0" t="0" r="0" b="0"/>
                   <wp:docPr id="5" name="Picture 5"/>
@@ -6631,7 +6631,7 @@
       <w:pPr>
         <w:pStyle w:val="Heading2"/>
       </w:pPr>
-      <w:bookmarkStart w:id="25" w:name="_Toc242143100"/>
+      <w:bookmarkStart w:id="25" w:name="_Toc242148504"/>
       <w:r>
         <w:t>5.2 Comparison dashboard</w:t>
       </w:r>
@@ -6658,7 +6658,7 @@
           <w:noProof/>
         </w:rPr>
         <w:drawing>
-          <wp:inline distT="0" distB="0" distL="0" distR="0" wp14:anchorId="00F8A429" wp14:editId="5DBE6241">
+          <wp:inline distT="0" distB="0" distL="0" distR="0" wp14:anchorId="33103826" wp14:editId="1046D6C2">
             <wp:extent cx="5760000" cy="4600000"/>
             <wp:effectExtent l="0" t="0" r="0" b="0"/>
             <wp:docPr id="6" name="Picture 6"/>
@@ -6712,7 +6712,7 @@
           <w:noProof/>
         </w:rPr>
         <w:drawing>
-          <wp:inline distT="0" distB="0" distL="0" distR="0" wp14:anchorId="6BCC3BA4" wp14:editId="1518FAB1">
+          <wp:inline distT="0" distB="0" distL="0" distR="0" wp14:anchorId="08A998DC" wp14:editId="6D59F53A">
             <wp:extent cx="5760000" cy="4240000"/>
             <wp:effectExtent l="0" t="0" r="0" b="0"/>
             <wp:docPr id="7" name="Picture 7"/>
@@ -6766,7 +6766,7 @@
           <w:noProof/>
         </w:rPr>
         <w:drawing>
-          <wp:inline distT="0" distB="0" distL="0" distR="0" wp14:anchorId="7A56125E" wp14:editId="530B9795">
+          <wp:inline distT="0" distB="0" distL="0" distR="0" wp14:anchorId="2F21B2F3" wp14:editId="3ADAD7F0">
             <wp:extent cx="5760000" cy="3520000"/>
             <wp:effectExtent l="0" t="0" r="0" b="0"/>
             <wp:docPr id="8" name="Picture 8"/>
@@ -6815,7 +6815,7 @@
       <w:pPr>
         <w:pStyle w:val="Heading1"/>
       </w:pPr>
-      <w:bookmarkStart w:id="26" w:name="_Toc242143101"/>
+      <w:bookmarkStart w:id="26" w:name="_Toc242148505"/>
       <w:r>
         <w:t>6. Results and Comparison</w:t>
       </w:r>
@@ -8026,7 +8026,7 @@
                 <w:noProof/>
               </w:rPr>
               <w:drawing>
-                <wp:inline distT="0" distB="0" distL="0" distR="0" wp14:anchorId="7EC31DA5" wp14:editId="1E554013">
+                <wp:inline distT="0" distB="0" distL="0" distR="0" wp14:anchorId="789AECD9" wp14:editId="6A7D38CA">
                   <wp:extent cx="1944000" cy="1620000"/>
                   <wp:effectExtent l="0" t="0" r="0" b="0"/>
                   <wp:docPr id="9" name="Picture 9"/>
@@ -8087,7 +8087,7 @@
                 <w:noProof/>
               </w:rPr>
               <w:drawing>
-                <wp:inline distT="0" distB="0" distL="0" distR="0" wp14:anchorId="4787D991" wp14:editId="41B26026">
+                <wp:inline distT="0" distB="0" distL="0" distR="0" wp14:anchorId="60F8963E" wp14:editId="3BA8A1D7">
                   <wp:extent cx="1944000" cy="1620000"/>
                   <wp:effectExtent l="0" t="0" r="0" b="0"/>
                   <wp:docPr id="10" name="Picture 10"/>
@@ -8148,7 +8148,7 @@
                 <w:noProof/>
               </w:rPr>
               <w:drawing>
-                <wp:inline distT="0" distB="0" distL="0" distR="0" wp14:anchorId="731F6ECA" wp14:editId="17EA252F">
+                <wp:inline distT="0" distB="0" distL="0" distR="0" wp14:anchorId="4F557C5D" wp14:editId="1D90CBA9">
                   <wp:extent cx="1944000" cy="1620000"/>
                   <wp:effectExtent l="0" t="0" r="0" b="0"/>
                   <wp:docPr id="11" name="Picture 11"/>
@@ -8216,7 +8216,7 @@
           <w:noProof/>
         </w:rPr>
         <w:drawing>
-          <wp:inline distT="0" distB="0" distL="0" distR="0" wp14:anchorId="0CA141D6" wp14:editId="21676657">
+          <wp:inline distT="0" distB="0" distL="0" distR="0" wp14:anchorId="56E1DDFF" wp14:editId="320E640B">
             <wp:extent cx="5040000" cy="2592000"/>
             <wp:effectExtent l="0" t="0" r="0" b="0"/>
             <wp:docPr id="12" name="Picture 12"/>
@@ -8265,7 +8265,7 @@
       <w:pPr>
         <w:pStyle w:val="Heading2"/>
       </w:pPr>
-      <w:bookmarkStart w:id="27" w:name="_Toc242143102"/>
+      <w:bookmarkStart w:id="27" w:name="_Toc242148506"/>
       <w:r>
         <w:t>6.1 Discussion</w:t>
       </w:r>
@@ -8311,7 +8311,7 @@
       <w:pPr>
         <w:pStyle w:val="Heading1"/>
       </w:pPr>
-      <w:bookmarkStart w:id="28" w:name="_Toc242143103"/>
+      <w:bookmarkStart w:id="28" w:name="_Toc242148507"/>
       <w:r>
         <w:t>7. UI Testing with the Deep Learning Models</w:t>
       </w:r>
@@ -10263,7 +10263,7 @@
       <w:pPr>
         <w:pStyle w:val="Heading2"/>
       </w:pPr>
-      <w:bookmarkStart w:id="29" w:name="_Toc242143104"/>
+      <w:bookmarkStart w:id="29" w:name="_Toc242148508"/>
       <w:r>
         <w:t>7.1 Functional and edge-case tests</w:t>
       </w:r>
@@ -10356,7 +10356,7 @@
               <w:rPr>
                 <w:sz w:val="19"/>
               </w:rPr>
-              <w:t>Hazard in the first or second half of a clip, silence in the other</w:t>
+              <w:t>Each class's loudest second in the first or second half of a 2 s clip, silence in the other</w:t>
             </w:r>
           </w:p>
         </w:tc>
@@ -10369,7 +10369,7 @@
               <w:rPr>
                 <w:sz w:val="19"/>
               </w:rPr>
-              <w:t>hazard detected</w:t>
+              <w:t>same class either way</w:t>
             </w:r>
           </w:p>
         </w:tc>
@@ -10382,7 +10382,7 @@
               <w:rPr>
                 <w:sz w:val="19"/>
               </w:rPr>
-              <w:t>pass for all four hazard classes (server/test_clip_position.py)</w:t>
+              <w:t>pass for all five classes (server/test_clip_position.py)</w:t>
             </w:r>
           </w:p>
         </w:tc>
@@ -10400,7 +10400,7 @@
               <w:rPr>
                 <w:sz w:val="19"/>
               </w:rPr>
-              <w:t>Ambience followed by one second of silence</w:t>
+              <w:t>Two seconds of silence</w:t>
             </w:r>
           </w:p>
         </w:tc>
@@ -10413,7 +10413,7 @@
               <w:rPr>
                 <w:sz w:val="19"/>
               </w:rPr>
-              <w:t>ambience</w:t>
+              <w:t>ambience from every model</w:t>
             </w:r>
           </w:p>
         </w:tc>
@@ -10426,7 +10426,7 @@
               <w:rPr>
                 <w:sz w:val="19"/>
               </w:rPr>
-              <w:t>fail — distress_call (0.77); identical with the earlier model, see Section 8</w:t>
+              <w:t>pass (server/test_multi_model.py)</w:t>
             </w:r>
           </w:p>
         </w:tc>
@@ -10444,7 +10444,7 @@
               <w:rPr>
                 <w:sz w:val="19"/>
               </w:rPr>
-              <w:t>Two seconds of silence</w:t>
+              <w:t>0.33 s clip</w:t>
             </w:r>
           </w:p>
         </w:tc>
@@ -10457,7 +10457,7 @@
               <w:rPr>
                 <w:sz w:val="19"/>
               </w:rPr>
-              <w:t>ambience from every model</w:t>
+              <w:t>every model answers</w:t>
             </w:r>
           </w:p>
         </w:tc>
@@ -10488,7 +10488,7 @@
               <w:rPr>
                 <w:sz w:val="19"/>
               </w:rPr>
-              <w:t>0.33 s clip</w:t>
+              <w:t>Unknown model key</w:t>
             </w:r>
           </w:p>
         </w:tc>
@@ -10501,7 +10501,7 @@
               <w:rPr>
                 <w:sz w:val="19"/>
               </w:rPr>
-              <w:t>every model answers</w:t>
+              <w:t>HTTP 404, server keeps running</w:t>
             </w:r>
           </w:p>
         </w:tc>
@@ -10514,7 +10514,7 @@
               <w:rPr>
                 <w:sz w:val="19"/>
               </w:rPr>
-              <w:t>pass (server/test_multi_model.py)</w:t>
+              <w:t>pass</w:t>
             </w:r>
           </w:p>
         </w:tc>
@@ -10532,7 +10532,7 @@
               <w:rPr>
                 <w:sz w:val="19"/>
               </w:rPr>
-              <w:t>Unknown model key</w:t>
+              <w:t>One model's bundle missing</w:t>
             </w:r>
           </w:p>
         </w:tc>
@@ -10545,7 +10545,7 @@
               <w:rPr>
                 <w:sz w:val="19"/>
               </w:rPr>
-              <w:t>HTTP 404, server keeps running</w:t>
+              <w:t>the other models keep serving</w:t>
             </w:r>
           </w:p>
         </w:tc>
@@ -10558,7 +10558,7 @@
               <w:rPr>
                 <w:sz w:val="19"/>
               </w:rPr>
-              <w:t>pass</w:t>
+              <w:t>pass — HTTP 503 for that model only</w:t>
             </w:r>
           </w:p>
         </w:tc>
@@ -10659,10 +10659,10 @@
         <w:jc w:val="both"/>
       </w:pPr>
       <w:r>
-        <w:t>Every model recognised all sixteen hazard clips except one horn clip that the MFCC-CNN called a distress call. The failures are concentrated in ambience. This is the cost of the serving rule in Section 4.8, which lets any single window classified as a hazard decide the whole clip: a deliberate bias towards false alarms over missed events. The test clips also make it harder than everyday use, because each one is cut around the loudest second of its recording, so a background recording is represented by its m</w:t>
+        <w:t xml:space="preserve">Of 48 model-by-clip decisions on hazard clips, 1 was wrong (horn_skid_4.wav → distress_call by the MFCC-CNN). The remaining failures are in ambience. This is the cost of the serving rule in Section 4.8, which lets any single window classified as a hazard decide the whole clip: a deliberate bias towards false alarms over missed events. The test clips also make it harder than everyday use, because each one is cut around the loudest second of its recording, so a background recording is represented by its most </w:t>
       </w:r>
       <w:r>
-        <w:t>ost event-like moment. Window-level ambience recall on the offline test split is much higher (Table 6.2), and a practical refinement is to require a hazard in two consecutive windows before alerting.</w:t>
+        <w:t>event-like moment. Window-level ambience recall on the offline test split is much higher (Table 6.2), and a practical refinement is to require a hazard in two consecutive windows before alerting.</w:t>
       </w:r>
     </w:p>
     <w:p>
@@ -10678,7 +10678,7 @@
       <w:pPr>
         <w:pStyle w:val="Heading1"/>
       </w:pPr>
-      <w:bookmarkStart w:id="30" w:name="_Toc242143105"/>
+      <w:bookmarkStart w:id="30" w:name="_Toc242148509"/>
       <w:r>
         <w:t>8. Limitations and Future Work</w:t>
       </w:r>
@@ -10713,7 +10713,7 @@
         <w:pStyle w:val="ListBullet"/>
       </w:pPr>
       <w:r>
-        <w:t>Ambience followed by silence is misread as distress_call. The earlier model behaves the same, which points at pre-processing rather than the retrained weights; a likely cause, not yet confirmed, is per-window standardisation stretching the quiet tail to unit variance.</w:t>
+        <w:t>During development, one quiet ambience recording from the training data, followed by a second of silence, was misread as distress_call by both the earlier and the current CRNN (the held-out ambience clip passes the same test). A likely cause, not yet confirmed, is per-window standardisation stretching a quiet tail to unit variance.</w:t>
       </w:r>
     </w:p>
     <w:p>
@@ -10752,7 +10752,7 @@
       <w:pPr>
         <w:pStyle w:val="Heading1"/>
       </w:pPr>
-      <w:bookmarkStart w:id="31" w:name="_Toc242143106"/>
+      <w:bookmarkStart w:id="31" w:name="_Toc242148510"/>
       <w:r>
         <w:t>9. Conclusion</w:t>
       </w:r>
@@ -10774,7 +10774,7 @@
       <w:pPr>
         <w:pStyle w:val="Heading1"/>
       </w:pPr>
-      <w:bookmarkStart w:id="32" w:name="_Toc242143107"/>
+      <w:bookmarkStart w:id="32" w:name="_Toc242148511"/>
       <w:r>
         <w:t>10. Individual Contributions</w:t>
       </w:r>
@@ -10896,7 +10896,7 @@
       <w:pPr>
         <w:pStyle w:val="Heading1"/>
       </w:pPr>
-      <w:bookmarkStart w:id="33" w:name="_Toc242143108"/>
+      <w:bookmarkStart w:id="33" w:name="_Toc242148512"/>
       <w:r>
         <w:t>References</w:t>
       </w:r>
@@ -11327,31 +11327,31 @@
       </w:rPr>
     </w:lvl>
   </w:abstractNum>
-  <w:num w:numId="1" w16cid:durableId="846480381">
+  <w:num w:numId="1" w16cid:durableId="635524585">
     <w:abstractNumId w:val="8"/>
   </w:num>
-  <w:num w:numId="2" w16cid:durableId="1123764971">
+  <w:num w:numId="2" w16cid:durableId="1602447046">
     <w:abstractNumId w:val="6"/>
   </w:num>
-  <w:num w:numId="3" w16cid:durableId="1931815904">
+  <w:num w:numId="3" w16cid:durableId="838272897">
     <w:abstractNumId w:val="5"/>
   </w:num>
-  <w:num w:numId="4" w16cid:durableId="2129660122">
+  <w:num w:numId="4" w16cid:durableId="1723597288">
     <w:abstractNumId w:val="4"/>
   </w:num>
-  <w:num w:numId="5" w16cid:durableId="152571110">
+  <w:num w:numId="5" w16cid:durableId="1602911627">
     <w:abstractNumId w:val="7"/>
   </w:num>
-  <w:num w:numId="6" w16cid:durableId="1215311817">
+  <w:num w:numId="6" w16cid:durableId="1372265180">
     <w:abstractNumId w:val="3"/>
   </w:num>
-  <w:num w:numId="7" w16cid:durableId="658072511">
+  <w:num w:numId="7" w16cid:durableId="1419137026">
     <w:abstractNumId w:val="2"/>
   </w:num>
-  <w:num w:numId="8" w16cid:durableId="2122340818">
+  <w:num w:numId="8" w16cid:durableId="1423842825">
     <w:abstractNumId w:val="1"/>
   </w:num>
-  <w:num w:numId="9" w16cid:durableId="273561647">
+  <w:num w:numId="9" w16cid:durableId="1277441681">
     <w:abstractNumId w:val="0"/>
   </w:num>
 </w:numbering>
@@ -22747,7 +22747,7 @@
     <w:autoRedefine/>
     <w:uiPriority w:val="39"/>
     <w:unhideWhenUsed/>
-    <w:rsid w:val="00CD2D36"/>
+    <w:rsid w:val="00EF77B8"/>
     <w:pPr>
       <w:spacing w:after="100"/>
     </w:pPr>
@@ -22759,7 +22759,7 @@
     <w:autoRedefine/>
     <w:uiPriority w:val="39"/>
     <w:unhideWhenUsed/>
-    <w:rsid w:val="00CD2D36"/>
+    <w:rsid w:val="00EF77B8"/>
     <w:pPr>
       <w:spacing w:after="100"/>
       <w:ind w:left="240"/>
@@ -22770,7 +22770,7 @@
     <w:basedOn w:val="DefaultParagraphFont"/>
     <w:uiPriority w:val="99"/>
     <w:unhideWhenUsed/>
-    <w:rsid w:val="00CD2D36"/>
+    <w:rsid w:val="00EF77B8"/>
     <w:rPr>
       <w:color w:val="0000FF" w:themeColor="hyperlink"/>
       <w:u w:val="single"/>

</xml_diff>